<commit_message>
Pachete editori: orientare landscape, tabele încadrate, „Probleme de decis"
- pagină landscape cu margini de 1.5 cm
- lățimi de coloană fixate pe fiecare celulă (python-docx ignoră columns[].width)
- „Chestiuni" → „Probleme"; „Alăturat…" într-un paragraf separat, cu
  „Decizii structurale comune"
- toate cele 14 pachete regenerate

Co-Authored-By: Claude Opus 4.8 <noreply@anthropic.com>
</commit_message>
<xml_diff>
--- a/pentru-editori/01-pediatrie/01-pediatrie.docx
+++ b/pentru-editori/01-pediatrie/01-pediatrie.docx
@@ -18,7 +18,15 @@
         <w:rPr>
           <w:i/>
         </w:rPr>
-        <w:t>Vă rugăm să completați coloanele „Decizie” și „Comentariu” direct în tabele (Aprobat / Respins / Amânat), fără să modificați structura lor. Alăturat: GHID.csv, conținutul integral al ghidului.</w:t>
+        <w:t>Vă rugăm să completați coloanele „Decizie” și „Comentariu” direct în tabele (Aprobat / Respins / Amânat), fără să modificați structura lor.</w:t>
+      </w:r>
+    </w:p>
+    <w:p>
+      <w:r>
+        <w:rPr>
+          <w:i/>
+        </w:rPr>
+        <w:t>Alăturat: GHID.csv, conținutul integral al ghidului, și „Decizii structurale comune”.</w:t>
       </w:r>
     </w:p>
     <w:p>
@@ -56,24 +64,25 @@
         <w:rPr>
           <w:color w:val="1C5D8C"/>
         </w:rPr>
-        <w:t>2. Chestiuni de decis</w:t>
+        <w:t>2. Probleme de decis</w:t>
       </w:r>
     </w:p>
     <w:tbl>
       <w:tblPr>
         <w:tblStyle w:val="LightGrid-Accent1"/>
         <w:tblW w:type="auto" w:w="0"/>
+        <w:tblLayout w:type="fixed"/>
         <w:tblLook w:firstColumn="1" w:firstRow="1" w:lastColumn="0" w:lastRow="0" w:noHBand="0" w:noVBand="1" w:val="04A0"/>
       </w:tblPr>
       <w:tblGrid>
-        <w:gridCol w:w="6400"/>
-        <w:gridCol w:w="2880"/>
-        <w:gridCol w:w="2880"/>
+        <w:gridCol w:w="4713"/>
+        <w:gridCol w:w="4713"/>
+        <w:gridCol w:w="4713"/>
       </w:tblGrid>
       <w:tr>
         <w:tc>
           <w:tcPr>
-            <w:tcW w:type="dxa" w:w="2880"/>
+            <w:tcW w:type="dxa" w:w="8400"/>
           </w:tcPr>
           <w:p>
             <w:r/>
@@ -82,13 +91,13 @@
                 <w:b/>
                 <w:i w:val="0"/>
               </w:rPr>
-              <w:t>Chestiune</w:t>
+              <w:t>Problemă</w:t>
             </w:r>
           </w:p>
         </w:tc>
         <w:tc>
           <w:tcPr>
-            <w:tcW w:type="dxa" w:w="2880"/>
+            <w:tcW w:type="dxa" w:w="2700"/>
           </w:tcPr>
           <w:p>
             <w:r/>
@@ -103,7 +112,7 @@
         </w:tc>
         <w:tc>
           <w:tcPr>
-            <w:tcW w:type="dxa" w:w="2880"/>
+            <w:tcW w:type="dxa" w:w="2700"/>
           </w:tcPr>
           <w:p>
             <w:r/>
@@ -120,7 +129,7 @@
       <w:tr>
         <w:tc>
           <w:tcPr>
-            <w:tcW w:type="dxa" w:w="6400"/>
+            <w:tcW w:type="dxa" w:w="8400"/>
           </w:tcPr>
           <w:p>
             <w:r/>
@@ -149,7 +158,7 @@
         </w:tc>
         <w:tc>
           <w:tcPr>
-            <w:tcW w:type="dxa" w:w="2880"/>
+            <w:tcW w:type="dxa" w:w="2700"/>
           </w:tcPr>
           <w:p>
             <w:r/>
@@ -163,7 +172,7 @@
         </w:tc>
         <w:tc>
           <w:tcPr>
-            <w:tcW w:type="dxa" w:w="2880"/>
+            <w:tcW w:type="dxa" w:w="2700"/>
           </w:tcPr>
           <w:p>
             <w:r/>
@@ -179,7 +188,7 @@
       <w:tr>
         <w:tc>
           <w:tcPr>
-            <w:tcW w:type="dxa" w:w="6400"/>
+            <w:tcW w:type="dxa" w:w="8400"/>
           </w:tcPr>
           <w:p>
             <w:r/>
@@ -208,7 +217,7 @@
         </w:tc>
         <w:tc>
           <w:tcPr>
-            <w:tcW w:type="dxa" w:w="2880"/>
+            <w:tcW w:type="dxa" w:w="2700"/>
           </w:tcPr>
           <w:p>
             <w:r/>
@@ -222,7 +231,7 @@
         </w:tc>
         <w:tc>
           <w:tcPr>
-            <w:tcW w:type="dxa" w:w="2880"/>
+            <w:tcW w:type="dxa" w:w="2700"/>
           </w:tcPr>
           <w:p>
             <w:r/>
@@ -238,7 +247,7 @@
       <w:tr>
         <w:tc>
           <w:tcPr>
-            <w:tcW w:type="dxa" w:w="6400"/>
+            <w:tcW w:type="dxa" w:w="8400"/>
           </w:tcPr>
           <w:p>
             <w:r/>
@@ -267,7 +276,7 @@
         </w:tc>
         <w:tc>
           <w:tcPr>
-            <w:tcW w:type="dxa" w:w="2880"/>
+            <w:tcW w:type="dxa" w:w="2700"/>
           </w:tcPr>
           <w:p>
             <w:r/>
@@ -281,7 +290,7 @@
         </w:tc>
         <w:tc>
           <w:tcPr>
-            <w:tcW w:type="dxa" w:w="2880"/>
+            <w:tcW w:type="dxa" w:w="2700"/>
           </w:tcPr>
           <w:p>
             <w:r/>
@@ -297,7 +306,7 @@
       <w:tr>
         <w:tc>
           <w:tcPr>
-            <w:tcW w:type="dxa" w:w="6400"/>
+            <w:tcW w:type="dxa" w:w="8400"/>
           </w:tcPr>
           <w:p>
             <w:r/>
@@ -326,7 +335,7 @@
         </w:tc>
         <w:tc>
           <w:tcPr>
-            <w:tcW w:type="dxa" w:w="2880"/>
+            <w:tcW w:type="dxa" w:w="2700"/>
           </w:tcPr>
           <w:p>
             <w:r/>
@@ -340,7 +349,7 @@
         </w:tc>
         <w:tc>
           <w:tcPr>
-            <w:tcW w:type="dxa" w:w="2880"/>
+            <w:tcW w:type="dxa" w:w="2700"/>
           </w:tcPr>
           <w:p>
             <w:r/>
@@ -393,22 +402,23 @@
       <w:tblPr>
         <w:tblStyle w:val="LightGrid-Accent1"/>
         <w:tblW w:type="auto" w:w="0"/>
+        <w:tblLayout w:type="fixed"/>
         <w:tblLook w:firstColumn="1" w:firstRow="1" w:lastColumn="0" w:lastRow="0" w:noHBand="0" w:noVBand="1" w:val="04A0"/>
       </w:tblPr>
       <w:tblGrid>
-        <w:gridCol w:w="1080"/>
-        <w:gridCol w:w="1080"/>
-        <w:gridCol w:w="1080"/>
-        <w:gridCol w:w="1080"/>
-        <w:gridCol w:w="1080"/>
-        <w:gridCol w:w="1080"/>
-        <w:gridCol w:w="1080"/>
-        <w:gridCol w:w="1080"/>
+        <w:gridCol w:w="1767"/>
+        <w:gridCol w:w="1767"/>
+        <w:gridCol w:w="1767"/>
+        <w:gridCol w:w="1767"/>
+        <w:gridCol w:w="1767"/>
+        <w:gridCol w:w="1767"/>
+        <w:gridCol w:w="1767"/>
+        <w:gridCol w:w="1767"/>
       </w:tblGrid>
       <w:tr>
         <w:tc>
           <w:tcPr>
-            <w:tcW w:type="dxa" w:w="1080"/>
+            <w:tcW w:type="dxa" w:w="800"/>
           </w:tcPr>
           <w:p>
             <w:r/>
@@ -423,7 +433,7 @@
         </w:tc>
         <w:tc>
           <w:tcPr>
-            <w:tcW w:type="dxa" w:w="1080"/>
+            <w:tcW w:type="dxa" w:w="1800"/>
           </w:tcPr>
           <w:p>
             <w:r/>
@@ -438,7 +448,7 @@
         </w:tc>
         <w:tc>
           <w:tcPr>
-            <w:tcW w:type="dxa" w:w="1080"/>
+            <w:tcW w:type="dxa" w:w="3000"/>
           </w:tcPr>
           <w:p>
             <w:r/>
@@ -453,7 +463,7 @@
         </w:tc>
         <w:tc>
           <w:tcPr>
-            <w:tcW w:type="dxa" w:w="1080"/>
+            <w:tcW w:type="dxa" w:w="900"/>
           </w:tcPr>
           <w:p>
             <w:r/>
@@ -468,7 +478,7 @@
         </w:tc>
         <w:tc>
           <w:tcPr>
-            <w:tcW w:type="dxa" w:w="1080"/>
+            <w:tcW w:type="dxa" w:w="1100"/>
           </w:tcPr>
           <w:p>
             <w:r/>
@@ -483,7 +493,7 @@
         </w:tc>
         <w:tc>
           <w:tcPr>
-            <w:tcW w:type="dxa" w:w="1080"/>
+            <w:tcW w:type="dxa" w:w="3000"/>
           </w:tcPr>
           <w:p>
             <w:r/>
@@ -498,7 +508,7 @@
         </w:tc>
         <w:tc>
           <w:tcPr>
-            <w:tcW w:type="dxa" w:w="1080"/>
+            <w:tcW w:type="dxa" w:w="1500"/>
           </w:tcPr>
           <w:p>
             <w:r/>
@@ -513,7 +523,7 @@
         </w:tc>
         <w:tc>
           <w:tcPr>
-            <w:tcW w:type="dxa" w:w="1080"/>
+            <w:tcW w:type="dxa" w:w="1800"/>
           </w:tcPr>
           <w:p>
             <w:r/>
@@ -530,7 +540,7 @@
       <w:tr>
         <w:tc>
           <w:tcPr>
-            <w:tcW w:type="dxa" w:w="1080"/>
+            <w:tcW w:type="dxa" w:w="800"/>
           </w:tcPr>
           <w:p>
             <w:r/>
@@ -545,7 +555,7 @@
         </w:tc>
         <w:tc>
           <w:tcPr>
-            <w:tcW w:type="dxa" w:w="1080"/>
+            <w:tcW w:type="dxa" w:w="1800"/>
           </w:tcPr>
           <w:p>
             <w:r/>
@@ -560,7 +570,7 @@
         </w:tc>
         <w:tc>
           <w:tcPr>
-            <w:tcW w:type="dxa" w:w="1080"/>
+            <w:tcW w:type="dxa" w:w="3000"/>
           </w:tcPr>
           <w:p>
             <w:r/>
@@ -575,7 +585,7 @@
         </w:tc>
         <w:tc>
           <w:tcPr>
-            <w:tcW w:type="dxa" w:w="1080"/>
+            <w:tcW w:type="dxa" w:w="900"/>
           </w:tcPr>
           <w:p>
             <w:r/>
@@ -590,7 +600,7 @@
         </w:tc>
         <w:tc>
           <w:tcPr>
-            <w:tcW w:type="dxa" w:w="1080"/>
+            <w:tcW w:type="dxa" w:w="1100"/>
           </w:tcPr>
           <w:p>
             <w:r/>
@@ -605,7 +615,7 @@
         </w:tc>
         <w:tc>
           <w:tcPr>
-            <w:tcW w:type="dxa" w:w="1080"/>
+            <w:tcW w:type="dxa" w:w="3000"/>
           </w:tcPr>
           <w:p>
             <w:r/>
@@ -620,7 +630,7 @@
         </w:tc>
         <w:tc>
           <w:tcPr>
-            <w:tcW w:type="dxa" w:w="1080"/>
+            <w:tcW w:type="dxa" w:w="1500"/>
           </w:tcPr>
           <w:p>
             <w:r/>
@@ -634,7 +644,7 @@
         </w:tc>
         <w:tc>
           <w:tcPr>
-            <w:tcW w:type="dxa" w:w="1080"/>
+            <w:tcW w:type="dxa" w:w="1800"/>
           </w:tcPr>
           <w:p>
             <w:r/>
@@ -650,7 +660,7 @@
       <w:tr>
         <w:tc>
           <w:tcPr>
-            <w:tcW w:type="dxa" w:w="1080"/>
+            <w:tcW w:type="dxa" w:w="800"/>
           </w:tcPr>
           <w:p>
             <w:r/>
@@ -665,7 +675,7 @@
         </w:tc>
         <w:tc>
           <w:tcPr>
-            <w:tcW w:type="dxa" w:w="1080"/>
+            <w:tcW w:type="dxa" w:w="1800"/>
           </w:tcPr>
           <w:p>
             <w:r/>
@@ -680,7 +690,7 @@
         </w:tc>
         <w:tc>
           <w:tcPr>
-            <w:tcW w:type="dxa" w:w="1080"/>
+            <w:tcW w:type="dxa" w:w="3000"/>
           </w:tcPr>
           <w:p>
             <w:r/>
@@ -695,7 +705,7 @@
         </w:tc>
         <w:tc>
           <w:tcPr>
-            <w:tcW w:type="dxa" w:w="1080"/>
+            <w:tcW w:type="dxa" w:w="900"/>
           </w:tcPr>
           <w:p>
             <w:r/>
@@ -710,7 +720,7 @@
         </w:tc>
         <w:tc>
           <w:tcPr>
-            <w:tcW w:type="dxa" w:w="1080"/>
+            <w:tcW w:type="dxa" w:w="1100"/>
           </w:tcPr>
           <w:p>
             <w:r/>
@@ -725,7 +735,7 @@
         </w:tc>
         <w:tc>
           <w:tcPr>
-            <w:tcW w:type="dxa" w:w="1080"/>
+            <w:tcW w:type="dxa" w:w="3000"/>
           </w:tcPr>
           <w:p>
             <w:r/>
@@ -740,7 +750,7 @@
         </w:tc>
         <w:tc>
           <w:tcPr>
-            <w:tcW w:type="dxa" w:w="1080"/>
+            <w:tcW w:type="dxa" w:w="1500"/>
           </w:tcPr>
           <w:p>
             <w:r/>
@@ -754,7 +764,7 @@
         </w:tc>
         <w:tc>
           <w:tcPr>
-            <w:tcW w:type="dxa" w:w="1080"/>
+            <w:tcW w:type="dxa" w:w="1800"/>
           </w:tcPr>
           <w:p>
             <w:r/>
@@ -770,7 +780,7 @@
       <w:tr>
         <w:tc>
           <w:tcPr>
-            <w:tcW w:type="dxa" w:w="1080"/>
+            <w:tcW w:type="dxa" w:w="800"/>
           </w:tcPr>
           <w:p>
             <w:r/>
@@ -785,7 +795,7 @@
         </w:tc>
         <w:tc>
           <w:tcPr>
-            <w:tcW w:type="dxa" w:w="1080"/>
+            <w:tcW w:type="dxa" w:w="1800"/>
           </w:tcPr>
           <w:p>
             <w:r/>
@@ -800,7 +810,7 @@
         </w:tc>
         <w:tc>
           <w:tcPr>
-            <w:tcW w:type="dxa" w:w="1080"/>
+            <w:tcW w:type="dxa" w:w="3000"/>
           </w:tcPr>
           <w:p>
             <w:r/>
@@ -815,7 +825,7 @@
         </w:tc>
         <w:tc>
           <w:tcPr>
-            <w:tcW w:type="dxa" w:w="1080"/>
+            <w:tcW w:type="dxa" w:w="900"/>
           </w:tcPr>
           <w:p>
             <w:r/>
@@ -830,7 +840,7 @@
         </w:tc>
         <w:tc>
           <w:tcPr>
-            <w:tcW w:type="dxa" w:w="1080"/>
+            <w:tcW w:type="dxa" w:w="1100"/>
           </w:tcPr>
           <w:p>
             <w:r/>
@@ -845,7 +855,7 @@
         </w:tc>
         <w:tc>
           <w:tcPr>
-            <w:tcW w:type="dxa" w:w="1080"/>
+            <w:tcW w:type="dxa" w:w="3000"/>
           </w:tcPr>
           <w:p>
             <w:r/>
@@ -860,7 +870,7 @@
         </w:tc>
         <w:tc>
           <w:tcPr>
-            <w:tcW w:type="dxa" w:w="1080"/>
+            <w:tcW w:type="dxa" w:w="1500"/>
           </w:tcPr>
           <w:p>
             <w:r/>
@@ -874,7 +884,7 @@
         </w:tc>
         <w:tc>
           <w:tcPr>
-            <w:tcW w:type="dxa" w:w="1080"/>
+            <w:tcW w:type="dxa" w:w="1800"/>
           </w:tcPr>
           <w:p>
             <w:r/>
@@ -912,22 +922,23 @@
       <w:tblPr>
         <w:tblStyle w:val="LightGrid-Accent1"/>
         <w:tblW w:type="auto" w:w="0"/>
+        <w:tblLayout w:type="fixed"/>
         <w:tblLook w:firstColumn="1" w:firstRow="1" w:lastColumn="0" w:lastRow="0" w:noHBand="0" w:noVBand="1" w:val="04A0"/>
       </w:tblPr>
       <w:tblGrid>
-        <w:gridCol w:w="1080"/>
-        <w:gridCol w:w="1080"/>
-        <w:gridCol w:w="1080"/>
-        <w:gridCol w:w="1080"/>
-        <w:gridCol w:w="1080"/>
-        <w:gridCol w:w="1080"/>
-        <w:gridCol w:w="1080"/>
-        <w:gridCol w:w="1080"/>
+        <w:gridCol w:w="1767"/>
+        <w:gridCol w:w="1767"/>
+        <w:gridCol w:w="1767"/>
+        <w:gridCol w:w="1767"/>
+        <w:gridCol w:w="1767"/>
+        <w:gridCol w:w="1767"/>
+        <w:gridCol w:w="1767"/>
+        <w:gridCol w:w="1767"/>
       </w:tblGrid>
       <w:tr>
         <w:tc>
           <w:tcPr>
-            <w:tcW w:type="dxa" w:w="1080"/>
+            <w:tcW w:type="dxa" w:w="800"/>
           </w:tcPr>
           <w:p>
             <w:r/>
@@ -942,7 +953,7 @@
         </w:tc>
         <w:tc>
           <w:tcPr>
-            <w:tcW w:type="dxa" w:w="1080"/>
+            <w:tcW w:type="dxa" w:w="1800"/>
           </w:tcPr>
           <w:p>
             <w:r/>
@@ -957,7 +968,7 @@
         </w:tc>
         <w:tc>
           <w:tcPr>
-            <w:tcW w:type="dxa" w:w="1080"/>
+            <w:tcW w:type="dxa" w:w="3000"/>
           </w:tcPr>
           <w:p>
             <w:r/>
@@ -972,7 +983,7 @@
         </w:tc>
         <w:tc>
           <w:tcPr>
-            <w:tcW w:type="dxa" w:w="1080"/>
+            <w:tcW w:type="dxa" w:w="900"/>
           </w:tcPr>
           <w:p>
             <w:r/>
@@ -987,7 +998,7 @@
         </w:tc>
         <w:tc>
           <w:tcPr>
-            <w:tcW w:type="dxa" w:w="1080"/>
+            <w:tcW w:type="dxa" w:w="1100"/>
           </w:tcPr>
           <w:p>
             <w:r/>
@@ -1002,7 +1013,7 @@
         </w:tc>
         <w:tc>
           <w:tcPr>
-            <w:tcW w:type="dxa" w:w="1080"/>
+            <w:tcW w:type="dxa" w:w="3000"/>
           </w:tcPr>
           <w:p>
             <w:r/>
@@ -1017,7 +1028,7 @@
         </w:tc>
         <w:tc>
           <w:tcPr>
-            <w:tcW w:type="dxa" w:w="1080"/>
+            <w:tcW w:type="dxa" w:w="1500"/>
           </w:tcPr>
           <w:p>
             <w:r/>
@@ -1032,7 +1043,7 @@
         </w:tc>
         <w:tc>
           <w:tcPr>
-            <w:tcW w:type="dxa" w:w="1080"/>
+            <w:tcW w:type="dxa" w:w="1800"/>
           </w:tcPr>
           <w:p>
             <w:r/>
@@ -1049,7 +1060,7 @@
       <w:tr>
         <w:tc>
           <w:tcPr>
-            <w:tcW w:type="dxa" w:w="1080"/>
+            <w:tcW w:type="dxa" w:w="800"/>
           </w:tcPr>
           <w:p>
             <w:r/>
@@ -1064,7 +1075,7 @@
         </w:tc>
         <w:tc>
           <w:tcPr>
-            <w:tcW w:type="dxa" w:w="1080"/>
+            <w:tcW w:type="dxa" w:w="1800"/>
           </w:tcPr>
           <w:p>
             <w:r/>
@@ -1079,7 +1090,7 @@
         </w:tc>
         <w:tc>
           <w:tcPr>
-            <w:tcW w:type="dxa" w:w="1080"/>
+            <w:tcW w:type="dxa" w:w="3000"/>
           </w:tcPr>
           <w:p>
             <w:r/>
@@ -1094,7 +1105,7 @@
         </w:tc>
         <w:tc>
           <w:tcPr>
-            <w:tcW w:type="dxa" w:w="1080"/>
+            <w:tcW w:type="dxa" w:w="900"/>
           </w:tcPr>
           <w:p>
             <w:r/>
@@ -1109,7 +1120,7 @@
         </w:tc>
         <w:tc>
           <w:tcPr>
-            <w:tcW w:type="dxa" w:w="1080"/>
+            <w:tcW w:type="dxa" w:w="1100"/>
           </w:tcPr>
           <w:p>
             <w:r/>
@@ -1124,7 +1135,7 @@
         </w:tc>
         <w:tc>
           <w:tcPr>
-            <w:tcW w:type="dxa" w:w="1080"/>
+            <w:tcW w:type="dxa" w:w="3000"/>
           </w:tcPr>
           <w:p>
             <w:r/>
@@ -1139,7 +1150,7 @@
         </w:tc>
         <w:tc>
           <w:tcPr>
-            <w:tcW w:type="dxa" w:w="1080"/>
+            <w:tcW w:type="dxa" w:w="1500"/>
           </w:tcPr>
           <w:p>
             <w:r/>
@@ -1153,7 +1164,7 @@
         </w:tc>
         <w:tc>
           <w:tcPr>
-            <w:tcW w:type="dxa" w:w="1080"/>
+            <w:tcW w:type="dxa" w:w="1800"/>
           </w:tcPr>
           <w:p>
             <w:r/>
@@ -1169,7 +1180,7 @@
       <w:tr>
         <w:tc>
           <w:tcPr>
-            <w:tcW w:type="dxa" w:w="1080"/>
+            <w:tcW w:type="dxa" w:w="800"/>
           </w:tcPr>
           <w:p>
             <w:r/>
@@ -1184,7 +1195,7 @@
         </w:tc>
         <w:tc>
           <w:tcPr>
-            <w:tcW w:type="dxa" w:w="1080"/>
+            <w:tcW w:type="dxa" w:w="1800"/>
           </w:tcPr>
           <w:p>
             <w:r/>
@@ -1199,7 +1210,7 @@
         </w:tc>
         <w:tc>
           <w:tcPr>
-            <w:tcW w:type="dxa" w:w="1080"/>
+            <w:tcW w:type="dxa" w:w="3000"/>
           </w:tcPr>
           <w:p>
             <w:r/>
@@ -1214,7 +1225,7 @@
         </w:tc>
         <w:tc>
           <w:tcPr>
-            <w:tcW w:type="dxa" w:w="1080"/>
+            <w:tcW w:type="dxa" w:w="900"/>
           </w:tcPr>
           <w:p>
             <w:r/>
@@ -1229,7 +1240,7 @@
         </w:tc>
         <w:tc>
           <w:tcPr>
-            <w:tcW w:type="dxa" w:w="1080"/>
+            <w:tcW w:type="dxa" w:w="1100"/>
           </w:tcPr>
           <w:p>
             <w:r/>
@@ -1244,7 +1255,7 @@
         </w:tc>
         <w:tc>
           <w:tcPr>
-            <w:tcW w:type="dxa" w:w="1080"/>
+            <w:tcW w:type="dxa" w:w="3000"/>
           </w:tcPr>
           <w:p>
             <w:r/>
@@ -1259,7 +1270,7 @@
         </w:tc>
         <w:tc>
           <w:tcPr>
-            <w:tcW w:type="dxa" w:w="1080"/>
+            <w:tcW w:type="dxa" w:w="1500"/>
           </w:tcPr>
           <w:p>
             <w:r/>
@@ -1273,7 +1284,7 @@
         </w:tc>
         <w:tc>
           <w:tcPr>
-            <w:tcW w:type="dxa" w:w="1080"/>
+            <w:tcW w:type="dxa" w:w="1800"/>
           </w:tcPr>
           <w:p>
             <w:r/>
@@ -1289,7 +1300,7 @@
       <w:tr>
         <w:tc>
           <w:tcPr>
-            <w:tcW w:type="dxa" w:w="1080"/>
+            <w:tcW w:type="dxa" w:w="800"/>
           </w:tcPr>
           <w:p>
             <w:r/>
@@ -1304,7 +1315,7 @@
         </w:tc>
         <w:tc>
           <w:tcPr>
-            <w:tcW w:type="dxa" w:w="1080"/>
+            <w:tcW w:type="dxa" w:w="1800"/>
           </w:tcPr>
           <w:p>
             <w:r/>
@@ -1319,7 +1330,7 @@
         </w:tc>
         <w:tc>
           <w:tcPr>
-            <w:tcW w:type="dxa" w:w="1080"/>
+            <w:tcW w:type="dxa" w:w="3000"/>
           </w:tcPr>
           <w:p>
             <w:r/>
@@ -1334,7 +1345,7 @@
         </w:tc>
         <w:tc>
           <w:tcPr>
-            <w:tcW w:type="dxa" w:w="1080"/>
+            <w:tcW w:type="dxa" w:w="900"/>
           </w:tcPr>
           <w:p>
             <w:r/>
@@ -1349,7 +1360,7 @@
         </w:tc>
         <w:tc>
           <w:tcPr>
-            <w:tcW w:type="dxa" w:w="1080"/>
+            <w:tcW w:type="dxa" w:w="1100"/>
           </w:tcPr>
           <w:p>
             <w:r/>
@@ -1364,7 +1375,7 @@
         </w:tc>
         <w:tc>
           <w:tcPr>
-            <w:tcW w:type="dxa" w:w="1080"/>
+            <w:tcW w:type="dxa" w:w="3000"/>
           </w:tcPr>
           <w:p>
             <w:r/>
@@ -1379,7 +1390,7 @@
         </w:tc>
         <w:tc>
           <w:tcPr>
-            <w:tcW w:type="dxa" w:w="1080"/>
+            <w:tcW w:type="dxa" w:w="1500"/>
           </w:tcPr>
           <w:p>
             <w:r/>
@@ -1393,7 +1404,7 @@
         </w:tc>
         <w:tc>
           <w:tcPr>
-            <w:tcW w:type="dxa" w:w="1080"/>
+            <w:tcW w:type="dxa" w:w="1800"/>
           </w:tcPr>
           <w:p>
             <w:r/>
@@ -1409,7 +1420,7 @@
       <w:tr>
         <w:tc>
           <w:tcPr>
-            <w:tcW w:type="dxa" w:w="1080"/>
+            <w:tcW w:type="dxa" w:w="800"/>
           </w:tcPr>
           <w:p>
             <w:r/>
@@ -1424,7 +1435,7 @@
         </w:tc>
         <w:tc>
           <w:tcPr>
-            <w:tcW w:type="dxa" w:w="1080"/>
+            <w:tcW w:type="dxa" w:w="1800"/>
           </w:tcPr>
           <w:p>
             <w:r/>
@@ -1439,7 +1450,7 @@
         </w:tc>
         <w:tc>
           <w:tcPr>
-            <w:tcW w:type="dxa" w:w="1080"/>
+            <w:tcW w:type="dxa" w:w="3000"/>
           </w:tcPr>
           <w:p>
             <w:r/>
@@ -1454,7 +1465,7 @@
         </w:tc>
         <w:tc>
           <w:tcPr>
-            <w:tcW w:type="dxa" w:w="1080"/>
+            <w:tcW w:type="dxa" w:w="900"/>
           </w:tcPr>
           <w:p>
             <w:r/>
@@ -1469,7 +1480,7 @@
         </w:tc>
         <w:tc>
           <w:tcPr>
-            <w:tcW w:type="dxa" w:w="1080"/>
+            <w:tcW w:type="dxa" w:w="1100"/>
           </w:tcPr>
           <w:p>
             <w:r/>
@@ -1484,7 +1495,7 @@
         </w:tc>
         <w:tc>
           <w:tcPr>
-            <w:tcW w:type="dxa" w:w="1080"/>
+            <w:tcW w:type="dxa" w:w="3000"/>
           </w:tcPr>
           <w:p>
             <w:r/>
@@ -1499,7 +1510,7 @@
         </w:tc>
         <w:tc>
           <w:tcPr>
-            <w:tcW w:type="dxa" w:w="1080"/>
+            <w:tcW w:type="dxa" w:w="1500"/>
           </w:tcPr>
           <w:p>
             <w:r/>
@@ -1513,7 +1524,7 @@
         </w:tc>
         <w:tc>
           <w:tcPr>
-            <w:tcW w:type="dxa" w:w="1080"/>
+            <w:tcW w:type="dxa" w:w="1800"/>
           </w:tcPr>
           <w:p>
             <w:r/>
@@ -1551,22 +1562,23 @@
       <w:tblPr>
         <w:tblStyle w:val="LightGrid-Accent1"/>
         <w:tblW w:type="auto" w:w="0"/>
+        <w:tblLayout w:type="fixed"/>
         <w:tblLook w:firstColumn="1" w:firstRow="1" w:lastColumn="0" w:lastRow="0" w:noHBand="0" w:noVBand="1" w:val="04A0"/>
       </w:tblPr>
       <w:tblGrid>
-        <w:gridCol w:w="1080"/>
-        <w:gridCol w:w="1080"/>
-        <w:gridCol w:w="1080"/>
-        <w:gridCol w:w="1080"/>
-        <w:gridCol w:w="1080"/>
-        <w:gridCol w:w="1080"/>
-        <w:gridCol w:w="1080"/>
-        <w:gridCol w:w="1080"/>
+        <w:gridCol w:w="1767"/>
+        <w:gridCol w:w="1767"/>
+        <w:gridCol w:w="1767"/>
+        <w:gridCol w:w="1767"/>
+        <w:gridCol w:w="1767"/>
+        <w:gridCol w:w="1767"/>
+        <w:gridCol w:w="1767"/>
+        <w:gridCol w:w="1767"/>
       </w:tblGrid>
       <w:tr>
         <w:tc>
           <w:tcPr>
-            <w:tcW w:type="dxa" w:w="1080"/>
+            <w:tcW w:type="dxa" w:w="800"/>
           </w:tcPr>
           <w:p>
             <w:r/>
@@ -1581,7 +1593,7 @@
         </w:tc>
         <w:tc>
           <w:tcPr>
-            <w:tcW w:type="dxa" w:w="1080"/>
+            <w:tcW w:type="dxa" w:w="1800"/>
           </w:tcPr>
           <w:p>
             <w:r/>
@@ -1596,7 +1608,7 @@
         </w:tc>
         <w:tc>
           <w:tcPr>
-            <w:tcW w:type="dxa" w:w="1080"/>
+            <w:tcW w:type="dxa" w:w="3000"/>
           </w:tcPr>
           <w:p>
             <w:r/>
@@ -1611,7 +1623,7 @@
         </w:tc>
         <w:tc>
           <w:tcPr>
-            <w:tcW w:type="dxa" w:w="1080"/>
+            <w:tcW w:type="dxa" w:w="900"/>
           </w:tcPr>
           <w:p>
             <w:r/>
@@ -1626,7 +1638,7 @@
         </w:tc>
         <w:tc>
           <w:tcPr>
-            <w:tcW w:type="dxa" w:w="1080"/>
+            <w:tcW w:type="dxa" w:w="1100"/>
           </w:tcPr>
           <w:p>
             <w:r/>
@@ -1641,7 +1653,7 @@
         </w:tc>
         <w:tc>
           <w:tcPr>
-            <w:tcW w:type="dxa" w:w="1080"/>
+            <w:tcW w:type="dxa" w:w="3000"/>
           </w:tcPr>
           <w:p>
             <w:r/>
@@ -1656,7 +1668,7 @@
         </w:tc>
         <w:tc>
           <w:tcPr>
-            <w:tcW w:type="dxa" w:w="1080"/>
+            <w:tcW w:type="dxa" w:w="1500"/>
           </w:tcPr>
           <w:p>
             <w:r/>
@@ -1671,7 +1683,7 @@
         </w:tc>
         <w:tc>
           <w:tcPr>
-            <w:tcW w:type="dxa" w:w="1080"/>
+            <w:tcW w:type="dxa" w:w="1800"/>
           </w:tcPr>
           <w:p>
             <w:r/>
@@ -1688,7 +1700,7 @@
       <w:tr>
         <w:tc>
           <w:tcPr>
-            <w:tcW w:type="dxa" w:w="1080"/>
+            <w:tcW w:type="dxa" w:w="800"/>
           </w:tcPr>
           <w:p>
             <w:r/>
@@ -1703,7 +1715,7 @@
         </w:tc>
         <w:tc>
           <w:tcPr>
-            <w:tcW w:type="dxa" w:w="1080"/>
+            <w:tcW w:type="dxa" w:w="1800"/>
           </w:tcPr>
           <w:p>
             <w:r/>
@@ -1718,7 +1730,7 @@
         </w:tc>
         <w:tc>
           <w:tcPr>
-            <w:tcW w:type="dxa" w:w="1080"/>
+            <w:tcW w:type="dxa" w:w="3000"/>
           </w:tcPr>
           <w:p>
             <w:r/>
@@ -1733,7 +1745,7 @@
         </w:tc>
         <w:tc>
           <w:tcPr>
-            <w:tcW w:type="dxa" w:w="1080"/>
+            <w:tcW w:type="dxa" w:w="900"/>
           </w:tcPr>
           <w:p>
             <w:r/>
@@ -1748,7 +1760,7 @@
         </w:tc>
         <w:tc>
           <w:tcPr>
-            <w:tcW w:type="dxa" w:w="1080"/>
+            <w:tcW w:type="dxa" w:w="1100"/>
           </w:tcPr>
           <w:p>
             <w:r/>
@@ -1763,7 +1775,7 @@
         </w:tc>
         <w:tc>
           <w:tcPr>
-            <w:tcW w:type="dxa" w:w="1080"/>
+            <w:tcW w:type="dxa" w:w="3000"/>
           </w:tcPr>
           <w:p>
             <w:r/>
@@ -1778,7 +1790,7 @@
         </w:tc>
         <w:tc>
           <w:tcPr>
-            <w:tcW w:type="dxa" w:w="1080"/>
+            <w:tcW w:type="dxa" w:w="1500"/>
           </w:tcPr>
           <w:p>
             <w:r/>
@@ -1792,7 +1804,7 @@
         </w:tc>
         <w:tc>
           <w:tcPr>
-            <w:tcW w:type="dxa" w:w="1080"/>
+            <w:tcW w:type="dxa" w:w="1800"/>
           </w:tcPr>
           <w:p>
             <w:r/>
@@ -1808,7 +1820,7 @@
       <w:tr>
         <w:tc>
           <w:tcPr>
-            <w:tcW w:type="dxa" w:w="1080"/>
+            <w:tcW w:type="dxa" w:w="800"/>
           </w:tcPr>
           <w:p>
             <w:r/>
@@ -1823,7 +1835,7 @@
         </w:tc>
         <w:tc>
           <w:tcPr>
-            <w:tcW w:type="dxa" w:w="1080"/>
+            <w:tcW w:type="dxa" w:w="1800"/>
           </w:tcPr>
           <w:p>
             <w:r/>
@@ -1838,7 +1850,7 @@
         </w:tc>
         <w:tc>
           <w:tcPr>
-            <w:tcW w:type="dxa" w:w="1080"/>
+            <w:tcW w:type="dxa" w:w="3000"/>
           </w:tcPr>
           <w:p>
             <w:r/>
@@ -1853,7 +1865,7 @@
         </w:tc>
         <w:tc>
           <w:tcPr>
-            <w:tcW w:type="dxa" w:w="1080"/>
+            <w:tcW w:type="dxa" w:w="900"/>
           </w:tcPr>
           <w:p>
             <w:r/>
@@ -1868,7 +1880,7 @@
         </w:tc>
         <w:tc>
           <w:tcPr>
-            <w:tcW w:type="dxa" w:w="1080"/>
+            <w:tcW w:type="dxa" w:w="1100"/>
           </w:tcPr>
           <w:p>
             <w:r/>
@@ -1883,7 +1895,7 @@
         </w:tc>
         <w:tc>
           <w:tcPr>
-            <w:tcW w:type="dxa" w:w="1080"/>
+            <w:tcW w:type="dxa" w:w="3000"/>
           </w:tcPr>
           <w:p>
             <w:r/>
@@ -1898,7 +1910,7 @@
         </w:tc>
         <w:tc>
           <w:tcPr>
-            <w:tcW w:type="dxa" w:w="1080"/>
+            <w:tcW w:type="dxa" w:w="1500"/>
           </w:tcPr>
           <w:p>
             <w:r/>
@@ -1912,7 +1924,7 @@
         </w:tc>
         <w:tc>
           <w:tcPr>
-            <w:tcW w:type="dxa" w:w="1080"/>
+            <w:tcW w:type="dxa" w:w="1800"/>
           </w:tcPr>
           <w:p>
             <w:r/>
@@ -1950,22 +1962,23 @@
       <w:tblPr>
         <w:tblStyle w:val="LightGrid-Accent1"/>
         <w:tblW w:type="auto" w:w="0"/>
+        <w:tblLayout w:type="fixed"/>
         <w:tblLook w:firstColumn="1" w:firstRow="1" w:lastColumn="0" w:lastRow="0" w:noHBand="0" w:noVBand="1" w:val="04A0"/>
       </w:tblPr>
       <w:tblGrid>
-        <w:gridCol w:w="1080"/>
-        <w:gridCol w:w="1080"/>
-        <w:gridCol w:w="1080"/>
-        <w:gridCol w:w="1080"/>
-        <w:gridCol w:w="1080"/>
-        <w:gridCol w:w="1080"/>
-        <w:gridCol w:w="1080"/>
-        <w:gridCol w:w="1080"/>
+        <w:gridCol w:w="1767"/>
+        <w:gridCol w:w="1767"/>
+        <w:gridCol w:w="1767"/>
+        <w:gridCol w:w="1767"/>
+        <w:gridCol w:w="1767"/>
+        <w:gridCol w:w="1767"/>
+        <w:gridCol w:w="1767"/>
+        <w:gridCol w:w="1767"/>
       </w:tblGrid>
       <w:tr>
         <w:tc>
           <w:tcPr>
-            <w:tcW w:type="dxa" w:w="1080"/>
+            <w:tcW w:type="dxa" w:w="800"/>
           </w:tcPr>
           <w:p>
             <w:r/>
@@ -1980,7 +1993,7 @@
         </w:tc>
         <w:tc>
           <w:tcPr>
-            <w:tcW w:type="dxa" w:w="1080"/>
+            <w:tcW w:type="dxa" w:w="1800"/>
           </w:tcPr>
           <w:p>
             <w:r/>
@@ -1995,7 +2008,7 @@
         </w:tc>
         <w:tc>
           <w:tcPr>
-            <w:tcW w:type="dxa" w:w="1080"/>
+            <w:tcW w:type="dxa" w:w="3000"/>
           </w:tcPr>
           <w:p>
             <w:r/>
@@ -2010,7 +2023,7 @@
         </w:tc>
         <w:tc>
           <w:tcPr>
-            <w:tcW w:type="dxa" w:w="1080"/>
+            <w:tcW w:type="dxa" w:w="900"/>
           </w:tcPr>
           <w:p>
             <w:r/>
@@ -2025,7 +2038,7 @@
         </w:tc>
         <w:tc>
           <w:tcPr>
-            <w:tcW w:type="dxa" w:w="1080"/>
+            <w:tcW w:type="dxa" w:w="1100"/>
           </w:tcPr>
           <w:p>
             <w:r/>
@@ -2040,7 +2053,7 @@
         </w:tc>
         <w:tc>
           <w:tcPr>
-            <w:tcW w:type="dxa" w:w="1080"/>
+            <w:tcW w:type="dxa" w:w="3000"/>
           </w:tcPr>
           <w:p>
             <w:r/>
@@ -2055,7 +2068,7 @@
         </w:tc>
         <w:tc>
           <w:tcPr>
-            <w:tcW w:type="dxa" w:w="1080"/>
+            <w:tcW w:type="dxa" w:w="1500"/>
           </w:tcPr>
           <w:p>
             <w:r/>
@@ -2070,7 +2083,7 @@
         </w:tc>
         <w:tc>
           <w:tcPr>
-            <w:tcW w:type="dxa" w:w="1080"/>
+            <w:tcW w:type="dxa" w:w="1800"/>
           </w:tcPr>
           <w:p>
             <w:r/>
@@ -2087,7 +2100,7 @@
       <w:tr>
         <w:tc>
           <w:tcPr>
-            <w:tcW w:type="dxa" w:w="1080"/>
+            <w:tcW w:type="dxa" w:w="800"/>
           </w:tcPr>
           <w:p>
             <w:r/>
@@ -2102,7 +2115,7 @@
         </w:tc>
         <w:tc>
           <w:tcPr>
-            <w:tcW w:type="dxa" w:w="1080"/>
+            <w:tcW w:type="dxa" w:w="1800"/>
           </w:tcPr>
           <w:p>
             <w:r/>
@@ -2117,7 +2130,7 @@
         </w:tc>
         <w:tc>
           <w:tcPr>
-            <w:tcW w:type="dxa" w:w="1080"/>
+            <w:tcW w:type="dxa" w:w="3000"/>
           </w:tcPr>
           <w:p>
             <w:r/>
@@ -2132,7 +2145,7 @@
         </w:tc>
         <w:tc>
           <w:tcPr>
-            <w:tcW w:type="dxa" w:w="1080"/>
+            <w:tcW w:type="dxa" w:w="900"/>
           </w:tcPr>
           <w:p>
             <w:r/>
@@ -2147,7 +2160,7 @@
         </w:tc>
         <w:tc>
           <w:tcPr>
-            <w:tcW w:type="dxa" w:w="1080"/>
+            <w:tcW w:type="dxa" w:w="1100"/>
           </w:tcPr>
           <w:p>
             <w:r/>
@@ -2162,7 +2175,7 @@
         </w:tc>
         <w:tc>
           <w:tcPr>
-            <w:tcW w:type="dxa" w:w="1080"/>
+            <w:tcW w:type="dxa" w:w="3000"/>
           </w:tcPr>
           <w:p>
             <w:r/>
@@ -2177,7 +2190,7 @@
         </w:tc>
         <w:tc>
           <w:tcPr>
-            <w:tcW w:type="dxa" w:w="1080"/>
+            <w:tcW w:type="dxa" w:w="1500"/>
           </w:tcPr>
           <w:p>
             <w:r/>
@@ -2191,7 +2204,7 @@
         </w:tc>
         <w:tc>
           <w:tcPr>
-            <w:tcW w:type="dxa" w:w="1080"/>
+            <w:tcW w:type="dxa" w:w="1800"/>
           </w:tcPr>
           <w:p>
             <w:r/>
@@ -2229,22 +2242,23 @@
       <w:tblPr>
         <w:tblStyle w:val="LightGrid-Accent1"/>
         <w:tblW w:type="auto" w:w="0"/>
+        <w:tblLayout w:type="fixed"/>
         <w:tblLook w:firstColumn="1" w:firstRow="1" w:lastColumn="0" w:lastRow="0" w:noHBand="0" w:noVBand="1" w:val="04A0"/>
       </w:tblPr>
       <w:tblGrid>
-        <w:gridCol w:w="1080"/>
-        <w:gridCol w:w="1080"/>
-        <w:gridCol w:w="1080"/>
-        <w:gridCol w:w="1080"/>
-        <w:gridCol w:w="1080"/>
-        <w:gridCol w:w="1080"/>
-        <w:gridCol w:w="1080"/>
-        <w:gridCol w:w="1080"/>
+        <w:gridCol w:w="1767"/>
+        <w:gridCol w:w="1767"/>
+        <w:gridCol w:w="1767"/>
+        <w:gridCol w:w="1767"/>
+        <w:gridCol w:w="1767"/>
+        <w:gridCol w:w="1767"/>
+        <w:gridCol w:w="1767"/>
+        <w:gridCol w:w="1767"/>
       </w:tblGrid>
       <w:tr>
         <w:tc>
           <w:tcPr>
-            <w:tcW w:type="dxa" w:w="1080"/>
+            <w:tcW w:type="dxa" w:w="800"/>
           </w:tcPr>
           <w:p>
             <w:r/>
@@ -2259,7 +2273,7 @@
         </w:tc>
         <w:tc>
           <w:tcPr>
-            <w:tcW w:type="dxa" w:w="1080"/>
+            <w:tcW w:type="dxa" w:w="1800"/>
           </w:tcPr>
           <w:p>
             <w:r/>
@@ -2274,7 +2288,7 @@
         </w:tc>
         <w:tc>
           <w:tcPr>
-            <w:tcW w:type="dxa" w:w="1080"/>
+            <w:tcW w:type="dxa" w:w="3000"/>
           </w:tcPr>
           <w:p>
             <w:r/>
@@ -2289,7 +2303,7 @@
         </w:tc>
         <w:tc>
           <w:tcPr>
-            <w:tcW w:type="dxa" w:w="1080"/>
+            <w:tcW w:type="dxa" w:w="900"/>
           </w:tcPr>
           <w:p>
             <w:r/>
@@ -2304,7 +2318,7 @@
         </w:tc>
         <w:tc>
           <w:tcPr>
-            <w:tcW w:type="dxa" w:w="1080"/>
+            <w:tcW w:type="dxa" w:w="1100"/>
           </w:tcPr>
           <w:p>
             <w:r/>
@@ -2319,7 +2333,7 @@
         </w:tc>
         <w:tc>
           <w:tcPr>
-            <w:tcW w:type="dxa" w:w="1080"/>
+            <w:tcW w:type="dxa" w:w="3000"/>
           </w:tcPr>
           <w:p>
             <w:r/>
@@ -2334,7 +2348,7 @@
         </w:tc>
         <w:tc>
           <w:tcPr>
-            <w:tcW w:type="dxa" w:w="1080"/>
+            <w:tcW w:type="dxa" w:w="1500"/>
           </w:tcPr>
           <w:p>
             <w:r/>
@@ -2349,7 +2363,7 @@
         </w:tc>
         <w:tc>
           <w:tcPr>
-            <w:tcW w:type="dxa" w:w="1080"/>
+            <w:tcW w:type="dxa" w:w="1800"/>
           </w:tcPr>
           <w:p>
             <w:r/>
@@ -2366,7 +2380,7 @@
       <w:tr>
         <w:tc>
           <w:tcPr>
-            <w:tcW w:type="dxa" w:w="1080"/>
+            <w:tcW w:type="dxa" w:w="800"/>
           </w:tcPr>
           <w:p>
             <w:r/>
@@ -2381,7 +2395,7 @@
         </w:tc>
         <w:tc>
           <w:tcPr>
-            <w:tcW w:type="dxa" w:w="1080"/>
+            <w:tcW w:type="dxa" w:w="1800"/>
           </w:tcPr>
           <w:p>
             <w:r/>
@@ -2396,7 +2410,7 @@
         </w:tc>
         <w:tc>
           <w:tcPr>
-            <w:tcW w:type="dxa" w:w="1080"/>
+            <w:tcW w:type="dxa" w:w="3000"/>
           </w:tcPr>
           <w:p>
             <w:r/>
@@ -2411,7 +2425,7 @@
         </w:tc>
         <w:tc>
           <w:tcPr>
-            <w:tcW w:type="dxa" w:w="1080"/>
+            <w:tcW w:type="dxa" w:w="900"/>
           </w:tcPr>
           <w:p>
             <w:r/>
@@ -2426,7 +2440,7 @@
         </w:tc>
         <w:tc>
           <w:tcPr>
-            <w:tcW w:type="dxa" w:w="1080"/>
+            <w:tcW w:type="dxa" w:w="1100"/>
           </w:tcPr>
           <w:p>
             <w:r/>
@@ -2441,7 +2455,7 @@
         </w:tc>
         <w:tc>
           <w:tcPr>
-            <w:tcW w:type="dxa" w:w="1080"/>
+            <w:tcW w:type="dxa" w:w="3000"/>
           </w:tcPr>
           <w:p>
             <w:r/>
@@ -2456,7 +2470,7 @@
         </w:tc>
         <w:tc>
           <w:tcPr>
-            <w:tcW w:type="dxa" w:w="1080"/>
+            <w:tcW w:type="dxa" w:w="1500"/>
           </w:tcPr>
           <w:p>
             <w:r/>
@@ -2470,7 +2484,7 @@
         </w:tc>
         <w:tc>
           <w:tcPr>
-            <w:tcW w:type="dxa" w:w="1080"/>
+            <w:tcW w:type="dxa" w:w="1800"/>
           </w:tcPr>
           <w:p>
             <w:r/>
@@ -2486,7 +2500,7 @@
       <w:tr>
         <w:tc>
           <w:tcPr>
-            <w:tcW w:type="dxa" w:w="1080"/>
+            <w:tcW w:type="dxa" w:w="800"/>
           </w:tcPr>
           <w:p>
             <w:r/>
@@ -2501,7 +2515,7 @@
         </w:tc>
         <w:tc>
           <w:tcPr>
-            <w:tcW w:type="dxa" w:w="1080"/>
+            <w:tcW w:type="dxa" w:w="1800"/>
           </w:tcPr>
           <w:p>
             <w:r/>
@@ -2516,7 +2530,7 @@
         </w:tc>
         <w:tc>
           <w:tcPr>
-            <w:tcW w:type="dxa" w:w="1080"/>
+            <w:tcW w:type="dxa" w:w="3000"/>
           </w:tcPr>
           <w:p>
             <w:r/>
@@ -2531,7 +2545,7 @@
         </w:tc>
         <w:tc>
           <w:tcPr>
-            <w:tcW w:type="dxa" w:w="1080"/>
+            <w:tcW w:type="dxa" w:w="900"/>
           </w:tcPr>
           <w:p>
             <w:r/>
@@ -2546,7 +2560,7 @@
         </w:tc>
         <w:tc>
           <w:tcPr>
-            <w:tcW w:type="dxa" w:w="1080"/>
+            <w:tcW w:type="dxa" w:w="1100"/>
           </w:tcPr>
           <w:p>
             <w:r/>
@@ -2561,7 +2575,7 @@
         </w:tc>
         <w:tc>
           <w:tcPr>
-            <w:tcW w:type="dxa" w:w="1080"/>
+            <w:tcW w:type="dxa" w:w="3000"/>
           </w:tcPr>
           <w:p>
             <w:r/>
@@ -2576,7 +2590,7 @@
         </w:tc>
         <w:tc>
           <w:tcPr>
-            <w:tcW w:type="dxa" w:w="1080"/>
+            <w:tcW w:type="dxa" w:w="1500"/>
           </w:tcPr>
           <w:p>
             <w:r/>
@@ -2590,7 +2604,7 @@
         </w:tc>
         <w:tc>
           <w:tcPr>
-            <w:tcW w:type="dxa" w:w="1080"/>
+            <w:tcW w:type="dxa" w:w="1800"/>
           </w:tcPr>
           <w:p>
             <w:r/>
@@ -2628,22 +2642,23 @@
       <w:tblPr>
         <w:tblStyle w:val="LightGrid-Accent1"/>
         <w:tblW w:type="auto" w:w="0"/>
+        <w:tblLayout w:type="fixed"/>
         <w:tblLook w:firstColumn="1" w:firstRow="1" w:lastColumn="0" w:lastRow="0" w:noHBand="0" w:noVBand="1" w:val="04A0"/>
       </w:tblPr>
       <w:tblGrid>
-        <w:gridCol w:w="1080"/>
-        <w:gridCol w:w="1080"/>
-        <w:gridCol w:w="1080"/>
-        <w:gridCol w:w="1080"/>
-        <w:gridCol w:w="1080"/>
-        <w:gridCol w:w="1080"/>
-        <w:gridCol w:w="1080"/>
-        <w:gridCol w:w="1080"/>
+        <w:gridCol w:w="1767"/>
+        <w:gridCol w:w="1767"/>
+        <w:gridCol w:w="1767"/>
+        <w:gridCol w:w="1767"/>
+        <w:gridCol w:w="1767"/>
+        <w:gridCol w:w="1767"/>
+        <w:gridCol w:w="1767"/>
+        <w:gridCol w:w="1767"/>
       </w:tblGrid>
       <w:tr>
         <w:tc>
           <w:tcPr>
-            <w:tcW w:type="dxa" w:w="1080"/>
+            <w:tcW w:type="dxa" w:w="800"/>
           </w:tcPr>
           <w:p>
             <w:r/>
@@ -2658,7 +2673,7 @@
         </w:tc>
         <w:tc>
           <w:tcPr>
-            <w:tcW w:type="dxa" w:w="1080"/>
+            <w:tcW w:type="dxa" w:w="1800"/>
           </w:tcPr>
           <w:p>
             <w:r/>
@@ -2673,7 +2688,7 @@
         </w:tc>
         <w:tc>
           <w:tcPr>
-            <w:tcW w:type="dxa" w:w="1080"/>
+            <w:tcW w:type="dxa" w:w="3000"/>
           </w:tcPr>
           <w:p>
             <w:r/>
@@ -2688,7 +2703,7 @@
         </w:tc>
         <w:tc>
           <w:tcPr>
-            <w:tcW w:type="dxa" w:w="1080"/>
+            <w:tcW w:type="dxa" w:w="900"/>
           </w:tcPr>
           <w:p>
             <w:r/>
@@ -2703,7 +2718,7 @@
         </w:tc>
         <w:tc>
           <w:tcPr>
-            <w:tcW w:type="dxa" w:w="1080"/>
+            <w:tcW w:type="dxa" w:w="1100"/>
           </w:tcPr>
           <w:p>
             <w:r/>
@@ -2718,7 +2733,7 @@
         </w:tc>
         <w:tc>
           <w:tcPr>
-            <w:tcW w:type="dxa" w:w="1080"/>
+            <w:tcW w:type="dxa" w:w="3000"/>
           </w:tcPr>
           <w:p>
             <w:r/>
@@ -2733,7 +2748,7 @@
         </w:tc>
         <w:tc>
           <w:tcPr>
-            <w:tcW w:type="dxa" w:w="1080"/>
+            <w:tcW w:type="dxa" w:w="1500"/>
           </w:tcPr>
           <w:p>
             <w:r/>
@@ -2748,7 +2763,7 @@
         </w:tc>
         <w:tc>
           <w:tcPr>
-            <w:tcW w:type="dxa" w:w="1080"/>
+            <w:tcW w:type="dxa" w:w="1800"/>
           </w:tcPr>
           <w:p>
             <w:r/>
@@ -2765,7 +2780,7 @@
       <w:tr>
         <w:tc>
           <w:tcPr>
-            <w:tcW w:type="dxa" w:w="1080"/>
+            <w:tcW w:type="dxa" w:w="800"/>
           </w:tcPr>
           <w:p>
             <w:r/>
@@ -2780,7 +2795,7 @@
         </w:tc>
         <w:tc>
           <w:tcPr>
-            <w:tcW w:type="dxa" w:w="1080"/>
+            <w:tcW w:type="dxa" w:w="1800"/>
           </w:tcPr>
           <w:p>
             <w:r/>
@@ -2795,7 +2810,7 @@
         </w:tc>
         <w:tc>
           <w:tcPr>
-            <w:tcW w:type="dxa" w:w="1080"/>
+            <w:tcW w:type="dxa" w:w="3000"/>
           </w:tcPr>
           <w:p>
             <w:r/>
@@ -2810,7 +2825,7 @@
         </w:tc>
         <w:tc>
           <w:tcPr>
-            <w:tcW w:type="dxa" w:w="1080"/>
+            <w:tcW w:type="dxa" w:w="900"/>
           </w:tcPr>
           <w:p>
             <w:r/>
@@ -2825,7 +2840,7 @@
         </w:tc>
         <w:tc>
           <w:tcPr>
-            <w:tcW w:type="dxa" w:w="1080"/>
+            <w:tcW w:type="dxa" w:w="1100"/>
           </w:tcPr>
           <w:p>
             <w:r/>
@@ -2840,7 +2855,7 @@
         </w:tc>
         <w:tc>
           <w:tcPr>
-            <w:tcW w:type="dxa" w:w="1080"/>
+            <w:tcW w:type="dxa" w:w="3000"/>
           </w:tcPr>
           <w:p>
             <w:r/>
@@ -2855,7 +2870,7 @@
         </w:tc>
         <w:tc>
           <w:tcPr>
-            <w:tcW w:type="dxa" w:w="1080"/>
+            <w:tcW w:type="dxa" w:w="1500"/>
           </w:tcPr>
           <w:p>
             <w:r/>
@@ -2869,7 +2884,7 @@
         </w:tc>
         <w:tc>
           <w:tcPr>
-            <w:tcW w:type="dxa" w:w="1080"/>
+            <w:tcW w:type="dxa" w:w="1800"/>
           </w:tcPr>
           <w:p>
             <w:r/>
@@ -2907,22 +2922,23 @@
       <w:tblPr>
         <w:tblStyle w:val="LightGrid-Accent1"/>
         <w:tblW w:type="auto" w:w="0"/>
+        <w:tblLayout w:type="fixed"/>
         <w:tblLook w:firstColumn="1" w:firstRow="1" w:lastColumn="0" w:lastRow="0" w:noHBand="0" w:noVBand="1" w:val="04A0"/>
       </w:tblPr>
       <w:tblGrid>
-        <w:gridCol w:w="1080"/>
-        <w:gridCol w:w="1080"/>
-        <w:gridCol w:w="1080"/>
-        <w:gridCol w:w="1080"/>
-        <w:gridCol w:w="1080"/>
-        <w:gridCol w:w="1080"/>
-        <w:gridCol w:w="1080"/>
-        <w:gridCol w:w="1080"/>
+        <w:gridCol w:w="1767"/>
+        <w:gridCol w:w="1767"/>
+        <w:gridCol w:w="1767"/>
+        <w:gridCol w:w="1767"/>
+        <w:gridCol w:w="1767"/>
+        <w:gridCol w:w="1767"/>
+        <w:gridCol w:w="1767"/>
+        <w:gridCol w:w="1767"/>
       </w:tblGrid>
       <w:tr>
         <w:tc>
           <w:tcPr>
-            <w:tcW w:type="dxa" w:w="1080"/>
+            <w:tcW w:type="dxa" w:w="800"/>
           </w:tcPr>
           <w:p>
             <w:r/>
@@ -2937,7 +2953,7 @@
         </w:tc>
         <w:tc>
           <w:tcPr>
-            <w:tcW w:type="dxa" w:w="1080"/>
+            <w:tcW w:type="dxa" w:w="1800"/>
           </w:tcPr>
           <w:p>
             <w:r/>
@@ -2952,7 +2968,7 @@
         </w:tc>
         <w:tc>
           <w:tcPr>
-            <w:tcW w:type="dxa" w:w="1080"/>
+            <w:tcW w:type="dxa" w:w="3000"/>
           </w:tcPr>
           <w:p>
             <w:r/>
@@ -2967,7 +2983,7 @@
         </w:tc>
         <w:tc>
           <w:tcPr>
-            <w:tcW w:type="dxa" w:w="1080"/>
+            <w:tcW w:type="dxa" w:w="900"/>
           </w:tcPr>
           <w:p>
             <w:r/>
@@ -2982,7 +2998,7 @@
         </w:tc>
         <w:tc>
           <w:tcPr>
-            <w:tcW w:type="dxa" w:w="1080"/>
+            <w:tcW w:type="dxa" w:w="1100"/>
           </w:tcPr>
           <w:p>
             <w:r/>
@@ -2997,7 +3013,7 @@
         </w:tc>
         <w:tc>
           <w:tcPr>
-            <w:tcW w:type="dxa" w:w="1080"/>
+            <w:tcW w:type="dxa" w:w="3000"/>
           </w:tcPr>
           <w:p>
             <w:r/>
@@ -3012,7 +3028,7 @@
         </w:tc>
         <w:tc>
           <w:tcPr>
-            <w:tcW w:type="dxa" w:w="1080"/>
+            <w:tcW w:type="dxa" w:w="1500"/>
           </w:tcPr>
           <w:p>
             <w:r/>
@@ -3027,7 +3043,7 @@
         </w:tc>
         <w:tc>
           <w:tcPr>
-            <w:tcW w:type="dxa" w:w="1080"/>
+            <w:tcW w:type="dxa" w:w="1800"/>
           </w:tcPr>
           <w:p>
             <w:r/>
@@ -3044,7 +3060,7 @@
       <w:tr>
         <w:tc>
           <w:tcPr>
-            <w:tcW w:type="dxa" w:w="1080"/>
+            <w:tcW w:type="dxa" w:w="800"/>
           </w:tcPr>
           <w:p>
             <w:r/>
@@ -3059,7 +3075,7 @@
         </w:tc>
         <w:tc>
           <w:tcPr>
-            <w:tcW w:type="dxa" w:w="1080"/>
+            <w:tcW w:type="dxa" w:w="1800"/>
           </w:tcPr>
           <w:p>
             <w:r/>
@@ -3074,7 +3090,7 @@
         </w:tc>
         <w:tc>
           <w:tcPr>
-            <w:tcW w:type="dxa" w:w="1080"/>
+            <w:tcW w:type="dxa" w:w="3000"/>
           </w:tcPr>
           <w:p>
             <w:r/>
@@ -3089,7 +3105,7 @@
         </w:tc>
         <w:tc>
           <w:tcPr>
-            <w:tcW w:type="dxa" w:w="1080"/>
+            <w:tcW w:type="dxa" w:w="900"/>
           </w:tcPr>
           <w:p>
             <w:r/>
@@ -3104,7 +3120,7 @@
         </w:tc>
         <w:tc>
           <w:tcPr>
-            <w:tcW w:type="dxa" w:w="1080"/>
+            <w:tcW w:type="dxa" w:w="1100"/>
           </w:tcPr>
           <w:p>
             <w:r/>
@@ -3119,7 +3135,7 @@
         </w:tc>
         <w:tc>
           <w:tcPr>
-            <w:tcW w:type="dxa" w:w="1080"/>
+            <w:tcW w:type="dxa" w:w="3000"/>
           </w:tcPr>
           <w:p>
             <w:r/>
@@ -3134,7 +3150,7 @@
         </w:tc>
         <w:tc>
           <w:tcPr>
-            <w:tcW w:type="dxa" w:w="1080"/>
+            <w:tcW w:type="dxa" w:w="1500"/>
           </w:tcPr>
           <w:p>
             <w:r/>
@@ -3148,7 +3164,7 @@
         </w:tc>
         <w:tc>
           <w:tcPr>
-            <w:tcW w:type="dxa" w:w="1080"/>
+            <w:tcW w:type="dxa" w:w="1800"/>
           </w:tcPr>
           <w:p>
             <w:r/>
@@ -3164,7 +3180,7 @@
       <w:tr>
         <w:tc>
           <w:tcPr>
-            <w:tcW w:type="dxa" w:w="1080"/>
+            <w:tcW w:type="dxa" w:w="800"/>
           </w:tcPr>
           <w:p>
             <w:r/>
@@ -3179,7 +3195,7 @@
         </w:tc>
         <w:tc>
           <w:tcPr>
-            <w:tcW w:type="dxa" w:w="1080"/>
+            <w:tcW w:type="dxa" w:w="1800"/>
           </w:tcPr>
           <w:p>
             <w:r/>
@@ -3194,7 +3210,7 @@
         </w:tc>
         <w:tc>
           <w:tcPr>
-            <w:tcW w:type="dxa" w:w="1080"/>
+            <w:tcW w:type="dxa" w:w="3000"/>
           </w:tcPr>
           <w:p>
             <w:r/>
@@ -3209,7 +3225,7 @@
         </w:tc>
         <w:tc>
           <w:tcPr>
-            <w:tcW w:type="dxa" w:w="1080"/>
+            <w:tcW w:type="dxa" w:w="900"/>
           </w:tcPr>
           <w:p>
             <w:r/>
@@ -3224,7 +3240,7 @@
         </w:tc>
         <w:tc>
           <w:tcPr>
-            <w:tcW w:type="dxa" w:w="1080"/>
+            <w:tcW w:type="dxa" w:w="1100"/>
           </w:tcPr>
           <w:p>
             <w:r/>
@@ -3239,7 +3255,7 @@
         </w:tc>
         <w:tc>
           <w:tcPr>
-            <w:tcW w:type="dxa" w:w="1080"/>
+            <w:tcW w:type="dxa" w:w="3000"/>
           </w:tcPr>
           <w:p>
             <w:r/>
@@ -3254,7 +3270,7 @@
         </w:tc>
         <w:tc>
           <w:tcPr>
-            <w:tcW w:type="dxa" w:w="1080"/>
+            <w:tcW w:type="dxa" w:w="1500"/>
           </w:tcPr>
           <w:p>
             <w:r/>
@@ -3268,7 +3284,7 @@
         </w:tc>
         <w:tc>
           <w:tcPr>
-            <w:tcW w:type="dxa" w:w="1080"/>
+            <w:tcW w:type="dxa" w:w="1800"/>
           </w:tcPr>
           <w:p>
             <w:r/>
@@ -3306,22 +3322,23 @@
       <w:tblPr>
         <w:tblStyle w:val="LightGrid-Accent1"/>
         <w:tblW w:type="auto" w:w="0"/>
+        <w:tblLayout w:type="fixed"/>
         <w:tblLook w:firstColumn="1" w:firstRow="1" w:lastColumn="0" w:lastRow="0" w:noHBand="0" w:noVBand="1" w:val="04A0"/>
       </w:tblPr>
       <w:tblGrid>
-        <w:gridCol w:w="1080"/>
-        <w:gridCol w:w="1080"/>
-        <w:gridCol w:w="1080"/>
-        <w:gridCol w:w="1080"/>
-        <w:gridCol w:w="1080"/>
-        <w:gridCol w:w="1080"/>
-        <w:gridCol w:w="1080"/>
-        <w:gridCol w:w="1080"/>
+        <w:gridCol w:w="1767"/>
+        <w:gridCol w:w="1767"/>
+        <w:gridCol w:w="1767"/>
+        <w:gridCol w:w="1767"/>
+        <w:gridCol w:w="1767"/>
+        <w:gridCol w:w="1767"/>
+        <w:gridCol w:w="1767"/>
+        <w:gridCol w:w="1767"/>
       </w:tblGrid>
       <w:tr>
         <w:tc>
           <w:tcPr>
-            <w:tcW w:type="dxa" w:w="1080"/>
+            <w:tcW w:type="dxa" w:w="800"/>
           </w:tcPr>
           <w:p>
             <w:r/>
@@ -3336,7 +3353,7 @@
         </w:tc>
         <w:tc>
           <w:tcPr>
-            <w:tcW w:type="dxa" w:w="1080"/>
+            <w:tcW w:type="dxa" w:w="1800"/>
           </w:tcPr>
           <w:p>
             <w:r/>
@@ -3351,7 +3368,7 @@
         </w:tc>
         <w:tc>
           <w:tcPr>
-            <w:tcW w:type="dxa" w:w="1080"/>
+            <w:tcW w:type="dxa" w:w="3000"/>
           </w:tcPr>
           <w:p>
             <w:r/>
@@ -3366,7 +3383,7 @@
         </w:tc>
         <w:tc>
           <w:tcPr>
-            <w:tcW w:type="dxa" w:w="1080"/>
+            <w:tcW w:type="dxa" w:w="900"/>
           </w:tcPr>
           <w:p>
             <w:r/>
@@ -3381,7 +3398,7 @@
         </w:tc>
         <w:tc>
           <w:tcPr>
-            <w:tcW w:type="dxa" w:w="1080"/>
+            <w:tcW w:type="dxa" w:w="1100"/>
           </w:tcPr>
           <w:p>
             <w:r/>
@@ -3396,7 +3413,7 @@
         </w:tc>
         <w:tc>
           <w:tcPr>
-            <w:tcW w:type="dxa" w:w="1080"/>
+            <w:tcW w:type="dxa" w:w="3000"/>
           </w:tcPr>
           <w:p>
             <w:r/>
@@ -3411,7 +3428,7 @@
         </w:tc>
         <w:tc>
           <w:tcPr>
-            <w:tcW w:type="dxa" w:w="1080"/>
+            <w:tcW w:type="dxa" w:w="1500"/>
           </w:tcPr>
           <w:p>
             <w:r/>
@@ -3426,7 +3443,7 @@
         </w:tc>
         <w:tc>
           <w:tcPr>
-            <w:tcW w:type="dxa" w:w="1080"/>
+            <w:tcW w:type="dxa" w:w="1800"/>
           </w:tcPr>
           <w:p>
             <w:r/>
@@ -3443,7 +3460,7 @@
       <w:tr>
         <w:tc>
           <w:tcPr>
-            <w:tcW w:type="dxa" w:w="1080"/>
+            <w:tcW w:type="dxa" w:w="800"/>
           </w:tcPr>
           <w:p>
             <w:r/>
@@ -3458,7 +3475,7 @@
         </w:tc>
         <w:tc>
           <w:tcPr>
-            <w:tcW w:type="dxa" w:w="1080"/>
+            <w:tcW w:type="dxa" w:w="1800"/>
           </w:tcPr>
           <w:p>
             <w:r/>
@@ -3473,7 +3490,7 @@
         </w:tc>
         <w:tc>
           <w:tcPr>
-            <w:tcW w:type="dxa" w:w="1080"/>
+            <w:tcW w:type="dxa" w:w="3000"/>
           </w:tcPr>
           <w:p>
             <w:r/>
@@ -3488,7 +3505,7 @@
         </w:tc>
         <w:tc>
           <w:tcPr>
-            <w:tcW w:type="dxa" w:w="1080"/>
+            <w:tcW w:type="dxa" w:w="900"/>
           </w:tcPr>
           <w:p>
             <w:r/>
@@ -3503,7 +3520,7 @@
         </w:tc>
         <w:tc>
           <w:tcPr>
-            <w:tcW w:type="dxa" w:w="1080"/>
+            <w:tcW w:type="dxa" w:w="1100"/>
           </w:tcPr>
           <w:p>
             <w:r/>
@@ -3518,7 +3535,7 @@
         </w:tc>
         <w:tc>
           <w:tcPr>
-            <w:tcW w:type="dxa" w:w="1080"/>
+            <w:tcW w:type="dxa" w:w="3000"/>
           </w:tcPr>
           <w:p>
             <w:r/>
@@ -3533,7 +3550,7 @@
         </w:tc>
         <w:tc>
           <w:tcPr>
-            <w:tcW w:type="dxa" w:w="1080"/>
+            <w:tcW w:type="dxa" w:w="1500"/>
           </w:tcPr>
           <w:p>
             <w:r/>
@@ -3547,7 +3564,7 @@
         </w:tc>
         <w:tc>
           <w:tcPr>
-            <w:tcW w:type="dxa" w:w="1080"/>
+            <w:tcW w:type="dxa" w:w="1800"/>
           </w:tcPr>
           <w:p>
             <w:r/>
@@ -3563,7 +3580,7 @@
       <w:tr>
         <w:tc>
           <w:tcPr>
-            <w:tcW w:type="dxa" w:w="1080"/>
+            <w:tcW w:type="dxa" w:w="800"/>
           </w:tcPr>
           <w:p>
             <w:r/>
@@ -3578,7 +3595,7 @@
         </w:tc>
         <w:tc>
           <w:tcPr>
-            <w:tcW w:type="dxa" w:w="1080"/>
+            <w:tcW w:type="dxa" w:w="1800"/>
           </w:tcPr>
           <w:p>
             <w:r/>
@@ -3593,7 +3610,7 @@
         </w:tc>
         <w:tc>
           <w:tcPr>
-            <w:tcW w:type="dxa" w:w="1080"/>
+            <w:tcW w:type="dxa" w:w="3000"/>
           </w:tcPr>
           <w:p>
             <w:r/>
@@ -3608,7 +3625,7 @@
         </w:tc>
         <w:tc>
           <w:tcPr>
-            <w:tcW w:type="dxa" w:w="1080"/>
+            <w:tcW w:type="dxa" w:w="900"/>
           </w:tcPr>
           <w:p>
             <w:r/>
@@ -3623,7 +3640,7 @@
         </w:tc>
         <w:tc>
           <w:tcPr>
-            <w:tcW w:type="dxa" w:w="1080"/>
+            <w:tcW w:type="dxa" w:w="1100"/>
           </w:tcPr>
           <w:p>
             <w:r/>
@@ -3638,7 +3655,7 @@
         </w:tc>
         <w:tc>
           <w:tcPr>
-            <w:tcW w:type="dxa" w:w="1080"/>
+            <w:tcW w:type="dxa" w:w="3000"/>
           </w:tcPr>
           <w:p>
             <w:r/>
@@ -3653,7 +3670,7 @@
         </w:tc>
         <w:tc>
           <w:tcPr>
-            <w:tcW w:type="dxa" w:w="1080"/>
+            <w:tcW w:type="dxa" w:w="1500"/>
           </w:tcPr>
           <w:p>
             <w:r/>
@@ -3667,7 +3684,7 @@
         </w:tc>
         <w:tc>
           <w:tcPr>
-            <w:tcW w:type="dxa" w:w="1080"/>
+            <w:tcW w:type="dxa" w:w="1800"/>
           </w:tcPr>
           <w:p>
             <w:r/>
@@ -3683,7 +3700,7 @@
       <w:tr>
         <w:tc>
           <w:tcPr>
-            <w:tcW w:type="dxa" w:w="1080"/>
+            <w:tcW w:type="dxa" w:w="800"/>
           </w:tcPr>
           <w:p>
             <w:r/>
@@ -3698,7 +3715,7 @@
         </w:tc>
         <w:tc>
           <w:tcPr>
-            <w:tcW w:type="dxa" w:w="1080"/>
+            <w:tcW w:type="dxa" w:w="1800"/>
           </w:tcPr>
           <w:p>
             <w:r/>
@@ -3713,7 +3730,7 @@
         </w:tc>
         <w:tc>
           <w:tcPr>
-            <w:tcW w:type="dxa" w:w="1080"/>
+            <w:tcW w:type="dxa" w:w="3000"/>
           </w:tcPr>
           <w:p>
             <w:r/>
@@ -3728,7 +3745,7 @@
         </w:tc>
         <w:tc>
           <w:tcPr>
-            <w:tcW w:type="dxa" w:w="1080"/>
+            <w:tcW w:type="dxa" w:w="900"/>
           </w:tcPr>
           <w:p>
             <w:r/>
@@ -3743,7 +3760,7 @@
         </w:tc>
         <w:tc>
           <w:tcPr>
-            <w:tcW w:type="dxa" w:w="1080"/>
+            <w:tcW w:type="dxa" w:w="1100"/>
           </w:tcPr>
           <w:p>
             <w:r/>
@@ -3758,7 +3775,7 @@
         </w:tc>
         <w:tc>
           <w:tcPr>
-            <w:tcW w:type="dxa" w:w="1080"/>
+            <w:tcW w:type="dxa" w:w="3000"/>
           </w:tcPr>
           <w:p>
             <w:r/>
@@ -3773,7 +3790,7 @@
         </w:tc>
         <w:tc>
           <w:tcPr>
-            <w:tcW w:type="dxa" w:w="1080"/>
+            <w:tcW w:type="dxa" w:w="1500"/>
           </w:tcPr>
           <w:p>
             <w:r/>
@@ -3787,7 +3804,7 @@
         </w:tc>
         <w:tc>
           <w:tcPr>
-            <w:tcW w:type="dxa" w:w="1080"/>
+            <w:tcW w:type="dxa" w:w="1800"/>
           </w:tcPr>
           <w:p>
             <w:r/>
@@ -3819,8 +3836,8 @@
       </w:r>
     </w:p>
     <w:sectPr>
-      <w:pgSz w:w="12240" w:h="15840"/>
-      <w:pgMar w:top="1440" w:right="1800" w:bottom="1440" w:left="1800" w:header="720" w:footer="720" w:gutter="0"/>
+      <w:pgSz w:w="15840" w:h="12240" w:orient="landscape"/>
+      <w:pgMar w:top="1440" w:right="850" w:bottom="1440" w:left="850" w:header="720" w:footer="720" w:gutter="0"/>
       <w:cols w:space="720"/>
       <w:docGrid w:linePitch="360"/>
     </w:sectPr>

</xml_diff>

<commit_message>
Pachete editori: antet de tabel alb, atașamente și reformulări
- Antetul tabelelor era negru deși codul cerea alb: `cell.text = ""` lasă în
  paragraf un run gol, iar culoarea se aplica pe acela, nu pe textul adăugat
  după. set_cell_text elimină acum run-ul rezidual.
- „vine din fișierul GHID.csv, transmis alături" → „vine din fișierele
  GHID.csv și GHID.html, atașate"; nota de la finalul introducerii aliniată.
- „Gradele și dozele sunt orientative — necesită validare. Fiecare rând,
  separat, se aprobă, se respinge sau se amână."

Cele 14 pachete regenerate (cel de Pediatrie preia și „sechestru pulmonar").

Co-Authored-By: Claude Opus 5 <noreply@anthropic.com>
</commit_message>
<xml_diff>
--- a/pentru-editori/01-pediatrie/01-pediatrie.docx
+++ b/pentru-editori/01-pediatrie/01-pediatrie.docx
@@ -33,7 +33,7 @@
     </w:p>
     <w:p>
       <w:r>
-        <w:t>Documentul cuprinde, pentru capitolul dumneavoastră: modificările deja aplicate (informativ), problemele rămase de decis, propunerile de conținut nou și duplicatele de rezolvat. Conținutul actual al capitolului nu este reprodus aici — vine din fișierul GHID.csv, transmis alături.</w:t>
+        <w:t>Documentul cuprinde, pentru capitolul dumneavoastră: modificările deja aplicate (informativ), problemele rămase de decis, propunerile de conținut nou și duplicatele de rezolvat. Conținutul actual al capitolului nu este reprodus aici — vine din fișierele GHID.csv și GHID.html, atașate.</w:t>
       </w:r>
     </w:p>
     <w:p>
@@ -47,7 +47,7 @@
           <w:i/>
           <w:color w:val="555555"/>
         </w:rPr>
-        <w:t>Transmise alături: GHID.csv — conținutul integral al ghidului — și memoul „Decizii structurale comune”, de citit înaintea acestui pachet.</w:t>
+        <w:t>Atașate: GHID.csv și GHID.html — conținutul integral al ghidului — și memoul „Decizii structurale comune”, de citit înaintea acestui pachet.</w:t>
       </w:r>
     </w:p>
     <w:p>
@@ -115,13 +115,9 @@
             </w:pPr>
             <w:r>
               <w:rPr>
-                <w:color w:val="FFFFFF"/>
-              </w:rPr>
-            </w:r>
-            <w:r>
-              <w:rPr>
                 <w:b/>
                 <w:i w:val="0"/>
+                <w:color w:val="FFFFFF"/>
                 <w:sz w:val="19"/>
               </w:rPr>
               <w:t>Problemă</w:t>
@@ -140,13 +136,9 @@
             </w:pPr>
             <w:r>
               <w:rPr>
-                <w:color w:val="FFFFFF"/>
-              </w:rPr>
-            </w:r>
-            <w:r>
-              <w:rPr>
                 <w:b/>
                 <w:i w:val="0"/>
+                <w:color w:val="FFFFFF"/>
                 <w:sz w:val="19"/>
               </w:rPr>
               <w:t>Decizie</w:t>
@@ -165,13 +157,9 @@
             </w:pPr>
             <w:r>
               <w:rPr>
-                <w:color w:val="FFFFFF"/>
-              </w:rPr>
-            </w:r>
-            <w:r>
-              <w:rPr>
                 <w:b/>
                 <w:i w:val="0"/>
+                <w:color w:val="FFFFFF"/>
                 <w:sz w:val="19"/>
               </w:rPr>
               <w:t>Comentariu</w:t>
@@ -189,7 +177,6 @@
             <w:pPr>
               <w:spacing w:after="60" w:line="240" w:lineRule="auto"/>
             </w:pPr>
-            <w:r/>
             <w:r>
               <w:rPr>
                 <w:b/>
@@ -242,7 +229,6 @@
             <w:pPr>
               <w:spacing w:after="40" w:line="240" w:lineRule="auto"/>
             </w:pPr>
-            <w:r/>
             <w:r>
               <w:rPr>
                 <w:b w:val="0"/>
@@ -261,7 +247,6 @@
             <w:pPr>
               <w:spacing w:after="40" w:line="240" w:lineRule="auto"/>
             </w:pPr>
-            <w:r/>
             <w:r>
               <w:rPr>
                 <w:b w:val="0"/>
@@ -282,7 +267,6 @@
             <w:pPr>
               <w:spacing w:after="60" w:line="240" w:lineRule="auto"/>
             </w:pPr>
-            <w:r/>
             <w:r>
               <w:rPr>
                 <w:b/>
@@ -335,7 +319,6 @@
             <w:pPr>
               <w:spacing w:after="40" w:line="240" w:lineRule="auto"/>
             </w:pPr>
-            <w:r/>
             <w:r>
               <w:rPr>
                 <w:b w:val="0"/>
@@ -354,7 +337,6 @@
             <w:pPr>
               <w:spacing w:after="40" w:line="240" w:lineRule="auto"/>
             </w:pPr>
-            <w:r/>
             <w:r>
               <w:rPr>
                 <w:b w:val="0"/>
@@ -375,7 +357,6 @@
             <w:pPr>
               <w:spacing w:after="60" w:line="240" w:lineRule="auto"/>
             </w:pPr>
-            <w:r/>
             <w:r>
               <w:rPr>
                 <w:b/>
@@ -428,7 +409,6 @@
             <w:pPr>
               <w:spacing w:after="40" w:line="240" w:lineRule="auto"/>
             </w:pPr>
-            <w:r/>
             <w:r>
               <w:rPr>
                 <w:b w:val="0"/>
@@ -447,7 +427,6 @@
             <w:pPr>
               <w:spacing w:after="40" w:line="240" w:lineRule="auto"/>
             </w:pPr>
-            <w:r/>
             <w:r>
               <w:rPr>
                 <w:b w:val="0"/>
@@ -468,7 +447,6 @@
             <w:pPr>
               <w:spacing w:after="60" w:line="240" w:lineRule="auto"/>
             </w:pPr>
-            <w:r/>
             <w:r>
               <w:rPr>
                 <w:b/>
@@ -521,7 +499,6 @@
             <w:pPr>
               <w:spacing w:after="40" w:line="240" w:lineRule="auto"/>
             </w:pPr>
-            <w:r/>
             <w:r>
               <w:rPr>
                 <w:b w:val="0"/>
@@ -540,7 +517,6 @@
             <w:pPr>
               <w:spacing w:after="40" w:line="240" w:lineRule="auto"/>
             </w:pPr>
-            <w:r/>
             <w:r>
               <w:rPr>
                 <w:b w:val="0"/>
@@ -562,7 +538,7 @@
     </w:p>
     <w:p>
       <w:r>
-        <w:t>Gradele și dozele sunt orientative — se validează clinic. Fiecare rând se aprobă, se respinge sau se amână separat.</w:t>
+        <w:t>Gradele și dozele sunt orientative — necesită validare. Fiecare rând, separat, se aprobă, se respinge sau se amână.</w:t>
       </w:r>
     </w:p>
     <w:p>
@@ -615,13 +591,9 @@
             </w:pPr>
             <w:r>
               <w:rPr>
-                <w:color w:val="FFFFFF"/>
-              </w:rPr>
-            </w:r>
-            <w:r>
-              <w:rPr>
                 <w:b/>
                 <w:i w:val="0"/>
+                <w:color w:val="FFFFFF"/>
                 <w:sz w:val="19"/>
               </w:rPr>
               <w:t>Tip</w:t>
@@ -640,13 +612,9 @@
             </w:pPr>
             <w:r>
               <w:rPr>
-                <w:color w:val="FFFFFF"/>
-              </w:rPr>
-            </w:r>
-            <w:r>
-              <w:rPr>
                 <w:b/>
                 <w:i w:val="0"/>
+                <w:color w:val="FFFFFF"/>
                 <w:sz w:val="19"/>
               </w:rPr>
               <w:t>Examen</w:t>
@@ -665,13 +633,9 @@
             </w:pPr>
             <w:r>
               <w:rPr>
-                <w:color w:val="FFFFFF"/>
-              </w:rPr>
-            </w:r>
-            <w:r>
-              <w:rPr>
                 <w:b/>
                 <w:i w:val="0"/>
+                <w:color w:val="FFFFFF"/>
                 <w:sz w:val="19"/>
               </w:rPr>
               <w:t>Indicație</w:t>
@@ -690,13 +654,9 @@
             </w:pPr>
             <w:r>
               <w:rPr>
-                <w:color w:val="FFFFFF"/>
-              </w:rPr>
-            </w:r>
-            <w:r>
-              <w:rPr>
                 <w:b/>
                 <w:i w:val="0"/>
+                <w:color w:val="FFFFFF"/>
                 <w:sz w:val="19"/>
               </w:rPr>
               <w:t>Grad</w:t>
@@ -715,13 +675,9 @@
             </w:pPr>
             <w:r>
               <w:rPr>
-                <w:color w:val="FFFFFF"/>
-              </w:rPr>
-            </w:r>
-            <w:r>
-              <w:rPr>
                 <w:b/>
                 <w:i w:val="0"/>
+                <w:color w:val="FFFFFF"/>
                 <w:sz w:val="19"/>
               </w:rPr>
               <w:t>Doză</w:t>
@@ -740,13 +696,9 @@
             </w:pPr>
             <w:r>
               <w:rPr>
-                <w:color w:val="FFFFFF"/>
-              </w:rPr>
-            </w:r>
-            <w:r>
-              <w:rPr>
                 <w:b/>
                 <w:i w:val="0"/>
+                <w:color w:val="FFFFFF"/>
                 <w:sz w:val="19"/>
               </w:rPr>
               <w:t>Comentarii</w:t>
@@ -765,13 +717,9 @@
             </w:pPr>
             <w:r>
               <w:rPr>
-                <w:color w:val="FFFFFF"/>
-              </w:rPr>
-            </w:r>
-            <w:r>
-              <w:rPr>
                 <w:b/>
                 <w:i w:val="0"/>
+                <w:color w:val="FFFFFF"/>
                 <w:sz w:val="19"/>
               </w:rPr>
               <w:t>Decizie</w:t>
@@ -790,13 +738,9 @@
             </w:pPr>
             <w:r>
               <w:rPr>
-                <w:color w:val="FFFFFF"/>
-              </w:rPr>
-            </w:r>
-            <w:r>
-              <w:rPr>
                 <w:b/>
                 <w:i w:val="0"/>
+                <w:color w:val="FFFFFF"/>
                 <w:sz w:val="19"/>
               </w:rPr>
               <w:t>Comentariu editor</w:t>
@@ -814,7 +758,6 @@
             <w:pPr>
               <w:spacing w:after="40" w:line="240" w:lineRule="auto"/>
             </w:pPr>
-            <w:r/>
             <w:r>
               <w:rPr>
                 <w:b w:val="0"/>
@@ -834,7 +777,6 @@
             <w:pPr>
               <w:spacing w:after="40" w:line="240" w:lineRule="auto"/>
             </w:pPr>
-            <w:r/>
             <w:r>
               <w:rPr>
                 <w:b w:val="0"/>
@@ -854,7 +796,6 @@
             <w:pPr>
               <w:spacing w:after="40" w:line="240" w:lineRule="auto"/>
             </w:pPr>
-            <w:r/>
             <w:r>
               <w:rPr>
                 <w:b w:val="0"/>
@@ -874,7 +815,6 @@
             <w:pPr>
               <w:spacing w:after="40" w:line="240" w:lineRule="auto"/>
             </w:pPr>
-            <w:r/>
             <w:r>
               <w:rPr>
                 <w:b w:val="0"/>
@@ -894,7 +834,6 @@
             <w:pPr>
               <w:spacing w:after="40" w:line="240" w:lineRule="auto"/>
             </w:pPr>
-            <w:r/>
             <w:r>
               <w:rPr>
                 <w:b w:val="0"/>
@@ -914,7 +853,6 @@
             <w:pPr>
               <w:spacing w:after="40" w:line="240" w:lineRule="auto"/>
             </w:pPr>
-            <w:r/>
             <w:r>
               <w:rPr>
                 <w:b w:val="0"/>
@@ -934,7 +872,6 @@
             <w:pPr>
               <w:spacing w:after="40" w:line="240" w:lineRule="auto"/>
             </w:pPr>
-            <w:r/>
             <w:r>
               <w:rPr>
                 <w:b w:val="0"/>
@@ -953,7 +890,6 @@
             <w:pPr>
               <w:spacing w:after="40" w:line="240" w:lineRule="auto"/>
             </w:pPr>
-            <w:r/>
             <w:r>
               <w:rPr>
                 <w:b w:val="0"/>
@@ -974,7 +910,6 @@
             <w:pPr>
               <w:spacing w:after="40" w:line="240" w:lineRule="auto"/>
             </w:pPr>
-            <w:r/>
             <w:r>
               <w:rPr>
                 <w:b w:val="0"/>
@@ -994,7 +929,6 @@
             <w:pPr>
               <w:spacing w:after="40" w:line="240" w:lineRule="auto"/>
             </w:pPr>
-            <w:r/>
             <w:r>
               <w:rPr>
                 <w:b w:val="0"/>
@@ -1014,7 +948,6 @@
             <w:pPr>
               <w:spacing w:after="40" w:line="240" w:lineRule="auto"/>
             </w:pPr>
-            <w:r/>
             <w:r>
               <w:rPr>
                 <w:b w:val="0"/>
@@ -1034,7 +967,6 @@
             <w:pPr>
               <w:spacing w:after="40" w:line="240" w:lineRule="auto"/>
             </w:pPr>
-            <w:r/>
             <w:r>
               <w:rPr>
                 <w:b w:val="0"/>
@@ -1054,7 +986,6 @@
             <w:pPr>
               <w:spacing w:after="40" w:line="240" w:lineRule="auto"/>
             </w:pPr>
-            <w:r/>
             <w:r>
               <w:rPr>
                 <w:b w:val="0"/>
@@ -1074,7 +1005,6 @@
             <w:pPr>
               <w:spacing w:after="40" w:line="240" w:lineRule="auto"/>
             </w:pPr>
-            <w:r/>
             <w:r>
               <w:rPr>
                 <w:b w:val="0"/>
@@ -1094,7 +1024,6 @@
             <w:pPr>
               <w:spacing w:after="40" w:line="240" w:lineRule="auto"/>
             </w:pPr>
-            <w:r/>
             <w:r>
               <w:rPr>
                 <w:b w:val="0"/>
@@ -1113,7 +1042,6 @@
             <w:pPr>
               <w:spacing w:after="40" w:line="240" w:lineRule="auto"/>
             </w:pPr>
-            <w:r/>
             <w:r>
               <w:rPr>
                 <w:b w:val="0"/>
@@ -1134,7 +1062,6 @@
             <w:pPr>
               <w:spacing w:after="40" w:line="240" w:lineRule="auto"/>
             </w:pPr>
-            <w:r/>
             <w:r>
               <w:rPr>
                 <w:b w:val="0"/>
@@ -1154,7 +1081,6 @@
             <w:pPr>
               <w:spacing w:after="40" w:line="240" w:lineRule="auto"/>
             </w:pPr>
-            <w:r/>
             <w:r>
               <w:rPr>
                 <w:b w:val="0"/>
@@ -1174,7 +1100,6 @@
             <w:pPr>
               <w:spacing w:after="40" w:line="240" w:lineRule="auto"/>
             </w:pPr>
-            <w:r/>
             <w:r>
               <w:rPr>
                 <w:b w:val="0"/>
@@ -1194,7 +1119,6 @@
             <w:pPr>
               <w:spacing w:after="40" w:line="240" w:lineRule="auto"/>
             </w:pPr>
-            <w:r/>
             <w:r>
               <w:rPr>
                 <w:b w:val="0"/>
@@ -1214,7 +1138,6 @@
             <w:pPr>
               <w:spacing w:after="40" w:line="240" w:lineRule="auto"/>
             </w:pPr>
-            <w:r/>
             <w:r>
               <w:rPr>
                 <w:b w:val="0"/>
@@ -1234,7 +1157,6 @@
             <w:pPr>
               <w:spacing w:after="40" w:line="240" w:lineRule="auto"/>
             </w:pPr>
-            <w:r/>
             <w:r>
               <w:rPr>
                 <w:b w:val="0"/>
@@ -1254,7 +1176,6 @@
             <w:pPr>
               <w:spacing w:after="40" w:line="240" w:lineRule="auto"/>
             </w:pPr>
-            <w:r/>
             <w:r>
               <w:rPr>
                 <w:b w:val="0"/>
@@ -1273,7 +1194,6 @@
             <w:pPr>
               <w:spacing w:after="40" w:line="240" w:lineRule="auto"/>
             </w:pPr>
-            <w:r/>
             <w:r>
               <w:rPr>
                 <w:b w:val="0"/>
@@ -1336,13 +1256,9 @@
             </w:pPr>
             <w:r>
               <w:rPr>
-                <w:color w:val="FFFFFF"/>
-              </w:rPr>
-            </w:r>
-            <w:r>
-              <w:rPr>
                 <w:b/>
                 <w:i w:val="0"/>
+                <w:color w:val="FFFFFF"/>
                 <w:sz w:val="19"/>
               </w:rPr>
               <w:t>Tip</w:t>
@@ -1361,13 +1277,9 @@
             </w:pPr>
             <w:r>
               <w:rPr>
-                <w:color w:val="FFFFFF"/>
-              </w:rPr>
-            </w:r>
-            <w:r>
-              <w:rPr>
                 <w:b/>
                 <w:i w:val="0"/>
+                <w:color w:val="FFFFFF"/>
                 <w:sz w:val="19"/>
               </w:rPr>
               <w:t>Examen</w:t>
@@ -1386,13 +1298,9 @@
             </w:pPr>
             <w:r>
               <w:rPr>
-                <w:color w:val="FFFFFF"/>
-              </w:rPr>
-            </w:r>
-            <w:r>
-              <w:rPr>
                 <w:b/>
                 <w:i w:val="0"/>
+                <w:color w:val="FFFFFF"/>
                 <w:sz w:val="19"/>
               </w:rPr>
               <w:t>Indicație</w:t>
@@ -1411,13 +1319,9 @@
             </w:pPr>
             <w:r>
               <w:rPr>
-                <w:color w:val="FFFFFF"/>
-              </w:rPr>
-            </w:r>
-            <w:r>
-              <w:rPr>
                 <w:b/>
                 <w:i w:val="0"/>
+                <w:color w:val="FFFFFF"/>
                 <w:sz w:val="19"/>
               </w:rPr>
               <w:t>Grad</w:t>
@@ -1436,13 +1340,9 @@
             </w:pPr>
             <w:r>
               <w:rPr>
-                <w:color w:val="FFFFFF"/>
-              </w:rPr>
-            </w:r>
-            <w:r>
-              <w:rPr>
                 <w:b/>
                 <w:i w:val="0"/>
+                <w:color w:val="FFFFFF"/>
                 <w:sz w:val="19"/>
               </w:rPr>
               <w:t>Doză</w:t>
@@ -1461,13 +1361,9 @@
             </w:pPr>
             <w:r>
               <w:rPr>
-                <w:color w:val="FFFFFF"/>
-              </w:rPr>
-            </w:r>
-            <w:r>
-              <w:rPr>
                 <w:b/>
                 <w:i w:val="0"/>
+                <w:color w:val="FFFFFF"/>
                 <w:sz w:val="19"/>
               </w:rPr>
               <w:t>Comentarii</w:t>
@@ -1486,13 +1382,9 @@
             </w:pPr>
             <w:r>
               <w:rPr>
-                <w:color w:val="FFFFFF"/>
-              </w:rPr>
-            </w:r>
-            <w:r>
-              <w:rPr>
                 <w:b/>
                 <w:i w:val="0"/>
+                <w:color w:val="FFFFFF"/>
                 <w:sz w:val="19"/>
               </w:rPr>
               <w:t>Decizie</w:t>
@@ -1511,13 +1403,9 @@
             </w:pPr>
             <w:r>
               <w:rPr>
-                <w:color w:val="FFFFFF"/>
-              </w:rPr>
-            </w:r>
-            <w:r>
-              <w:rPr>
                 <w:b/>
                 <w:i w:val="0"/>
+                <w:color w:val="FFFFFF"/>
                 <w:sz w:val="19"/>
               </w:rPr>
               <w:t>Comentariu editor</w:t>
@@ -1535,7 +1423,6 @@
             <w:pPr>
               <w:spacing w:after="40" w:line="240" w:lineRule="auto"/>
             </w:pPr>
-            <w:r/>
             <w:r>
               <w:rPr>
                 <w:b w:val="0"/>
@@ -1555,7 +1442,6 @@
             <w:pPr>
               <w:spacing w:after="40" w:line="240" w:lineRule="auto"/>
             </w:pPr>
-            <w:r/>
             <w:r>
               <w:rPr>
                 <w:b w:val="0"/>
@@ -1575,7 +1461,6 @@
             <w:pPr>
               <w:spacing w:after="40" w:line="240" w:lineRule="auto"/>
             </w:pPr>
-            <w:r/>
             <w:r>
               <w:rPr>
                 <w:b w:val="0"/>
@@ -1595,7 +1480,6 @@
             <w:pPr>
               <w:spacing w:after="40" w:line="240" w:lineRule="auto"/>
             </w:pPr>
-            <w:r/>
             <w:r>
               <w:rPr>
                 <w:b w:val="0"/>
@@ -1615,7 +1499,6 @@
             <w:pPr>
               <w:spacing w:after="40" w:line="240" w:lineRule="auto"/>
             </w:pPr>
-            <w:r/>
             <w:r>
               <w:rPr>
                 <w:b w:val="0"/>
@@ -1635,7 +1518,6 @@
             <w:pPr>
               <w:spacing w:after="40" w:line="240" w:lineRule="auto"/>
             </w:pPr>
-            <w:r/>
             <w:r>
               <w:rPr>
                 <w:b w:val="0"/>
@@ -1655,7 +1537,6 @@
             <w:pPr>
               <w:spacing w:after="40" w:line="240" w:lineRule="auto"/>
             </w:pPr>
-            <w:r/>
             <w:r>
               <w:rPr>
                 <w:b w:val="0"/>
@@ -1674,7 +1555,6 @@
             <w:pPr>
               <w:spacing w:after="40" w:line="240" w:lineRule="auto"/>
             </w:pPr>
-            <w:r/>
             <w:r>
               <w:rPr>
                 <w:b w:val="0"/>
@@ -1695,7 +1575,6 @@
             <w:pPr>
               <w:spacing w:after="40" w:line="240" w:lineRule="auto"/>
             </w:pPr>
-            <w:r/>
             <w:r>
               <w:rPr>
                 <w:b w:val="0"/>
@@ -1715,7 +1594,6 @@
             <w:pPr>
               <w:spacing w:after="40" w:line="240" w:lineRule="auto"/>
             </w:pPr>
-            <w:r/>
             <w:r>
               <w:rPr>
                 <w:b w:val="0"/>
@@ -1735,7 +1613,6 @@
             <w:pPr>
               <w:spacing w:after="40" w:line="240" w:lineRule="auto"/>
             </w:pPr>
-            <w:r/>
             <w:r>
               <w:rPr>
                 <w:b w:val="0"/>
@@ -1755,7 +1632,6 @@
             <w:pPr>
               <w:spacing w:after="40" w:line="240" w:lineRule="auto"/>
             </w:pPr>
-            <w:r/>
             <w:r>
               <w:rPr>
                 <w:b w:val="0"/>
@@ -1775,7 +1651,6 @@
             <w:pPr>
               <w:spacing w:after="40" w:line="240" w:lineRule="auto"/>
             </w:pPr>
-            <w:r/>
             <w:r>
               <w:rPr>
                 <w:b w:val="0"/>
@@ -1795,7 +1670,6 @@
             <w:pPr>
               <w:spacing w:after="40" w:line="240" w:lineRule="auto"/>
             </w:pPr>
-            <w:r/>
             <w:r>
               <w:rPr>
                 <w:b w:val="0"/>
@@ -1815,7 +1689,6 @@
             <w:pPr>
               <w:spacing w:after="40" w:line="240" w:lineRule="auto"/>
             </w:pPr>
-            <w:r/>
             <w:r>
               <w:rPr>
                 <w:b w:val="0"/>
@@ -1834,7 +1707,6 @@
             <w:pPr>
               <w:spacing w:after="40" w:line="240" w:lineRule="auto"/>
             </w:pPr>
-            <w:r/>
             <w:r>
               <w:rPr>
                 <w:b w:val="0"/>
@@ -1855,7 +1727,6 @@
             <w:pPr>
               <w:spacing w:after="40" w:line="240" w:lineRule="auto"/>
             </w:pPr>
-            <w:r/>
             <w:r>
               <w:rPr>
                 <w:b w:val="0"/>
@@ -1875,7 +1746,6 @@
             <w:pPr>
               <w:spacing w:after="40" w:line="240" w:lineRule="auto"/>
             </w:pPr>
-            <w:r/>
             <w:r>
               <w:rPr>
                 <w:b w:val="0"/>
@@ -1895,7 +1765,6 @@
             <w:pPr>
               <w:spacing w:after="40" w:line="240" w:lineRule="auto"/>
             </w:pPr>
-            <w:r/>
             <w:r>
               <w:rPr>
                 <w:b w:val="0"/>
@@ -1915,7 +1784,6 @@
             <w:pPr>
               <w:spacing w:after="40" w:line="240" w:lineRule="auto"/>
             </w:pPr>
-            <w:r/>
             <w:r>
               <w:rPr>
                 <w:b w:val="0"/>
@@ -1935,7 +1803,6 @@
             <w:pPr>
               <w:spacing w:after="40" w:line="240" w:lineRule="auto"/>
             </w:pPr>
-            <w:r/>
             <w:r>
               <w:rPr>
                 <w:b w:val="0"/>
@@ -1955,7 +1822,6 @@
             <w:pPr>
               <w:spacing w:after="40" w:line="240" w:lineRule="auto"/>
             </w:pPr>
-            <w:r/>
             <w:r>
               <w:rPr>
                 <w:b w:val="0"/>
@@ -1975,7 +1841,6 @@
             <w:pPr>
               <w:spacing w:after="40" w:line="240" w:lineRule="auto"/>
             </w:pPr>
-            <w:r/>
             <w:r>
               <w:rPr>
                 <w:b w:val="0"/>
@@ -1994,7 +1859,6 @@
             <w:pPr>
               <w:spacing w:after="40" w:line="240" w:lineRule="auto"/>
             </w:pPr>
-            <w:r/>
             <w:r>
               <w:rPr>
                 <w:b w:val="0"/>
@@ -2015,7 +1879,6 @@
             <w:pPr>
               <w:spacing w:after="40" w:line="240" w:lineRule="auto"/>
             </w:pPr>
-            <w:r/>
             <w:r>
               <w:rPr>
                 <w:b w:val="0"/>
@@ -2035,7 +1898,6 @@
             <w:pPr>
               <w:spacing w:after="40" w:line="240" w:lineRule="auto"/>
             </w:pPr>
-            <w:r/>
             <w:r>
               <w:rPr>
                 <w:b w:val="0"/>
@@ -2055,7 +1917,6 @@
             <w:pPr>
               <w:spacing w:after="40" w:line="240" w:lineRule="auto"/>
             </w:pPr>
-            <w:r/>
             <w:r>
               <w:rPr>
                 <w:b w:val="0"/>
@@ -2075,7 +1936,6 @@
             <w:pPr>
               <w:spacing w:after="40" w:line="240" w:lineRule="auto"/>
             </w:pPr>
-            <w:r/>
             <w:r>
               <w:rPr>
                 <w:b w:val="0"/>
@@ -2095,7 +1955,6 @@
             <w:pPr>
               <w:spacing w:after="40" w:line="240" w:lineRule="auto"/>
             </w:pPr>
-            <w:r/>
             <w:r>
               <w:rPr>
                 <w:b w:val="0"/>
@@ -2115,7 +1974,6 @@
             <w:pPr>
               <w:spacing w:after="40" w:line="240" w:lineRule="auto"/>
             </w:pPr>
-            <w:r/>
             <w:r>
               <w:rPr>
                 <w:b w:val="0"/>
@@ -2135,7 +1993,6 @@
             <w:pPr>
               <w:spacing w:after="40" w:line="240" w:lineRule="auto"/>
             </w:pPr>
-            <w:r/>
             <w:r>
               <w:rPr>
                 <w:b w:val="0"/>
@@ -2154,7 +2011,6 @@
             <w:pPr>
               <w:spacing w:after="40" w:line="240" w:lineRule="auto"/>
             </w:pPr>
-            <w:r/>
             <w:r>
               <w:rPr>
                 <w:b w:val="0"/>
@@ -2217,13 +2073,9 @@
             </w:pPr>
             <w:r>
               <w:rPr>
-                <w:color w:val="FFFFFF"/>
-              </w:rPr>
-            </w:r>
-            <w:r>
-              <w:rPr>
                 <w:b/>
                 <w:i w:val="0"/>
+                <w:color w:val="FFFFFF"/>
                 <w:sz w:val="19"/>
               </w:rPr>
               <w:t>Tip</w:t>
@@ -2242,13 +2094,9 @@
             </w:pPr>
             <w:r>
               <w:rPr>
-                <w:color w:val="FFFFFF"/>
-              </w:rPr>
-            </w:r>
-            <w:r>
-              <w:rPr>
                 <w:b/>
                 <w:i w:val="0"/>
+                <w:color w:val="FFFFFF"/>
                 <w:sz w:val="19"/>
               </w:rPr>
               <w:t>Examen</w:t>
@@ -2267,13 +2115,9 @@
             </w:pPr>
             <w:r>
               <w:rPr>
-                <w:color w:val="FFFFFF"/>
-              </w:rPr>
-            </w:r>
-            <w:r>
-              <w:rPr>
                 <w:b/>
                 <w:i w:val="0"/>
+                <w:color w:val="FFFFFF"/>
                 <w:sz w:val="19"/>
               </w:rPr>
               <w:t>Indicație</w:t>
@@ -2292,13 +2136,9 @@
             </w:pPr>
             <w:r>
               <w:rPr>
-                <w:color w:val="FFFFFF"/>
-              </w:rPr>
-            </w:r>
-            <w:r>
-              <w:rPr>
                 <w:b/>
                 <w:i w:val="0"/>
+                <w:color w:val="FFFFFF"/>
                 <w:sz w:val="19"/>
               </w:rPr>
               <w:t>Grad</w:t>
@@ -2317,13 +2157,9 @@
             </w:pPr>
             <w:r>
               <w:rPr>
-                <w:color w:val="FFFFFF"/>
-              </w:rPr>
-            </w:r>
-            <w:r>
-              <w:rPr>
                 <w:b/>
                 <w:i w:val="0"/>
+                <w:color w:val="FFFFFF"/>
                 <w:sz w:val="19"/>
               </w:rPr>
               <w:t>Doză</w:t>
@@ -2342,13 +2178,9 @@
             </w:pPr>
             <w:r>
               <w:rPr>
-                <w:color w:val="FFFFFF"/>
-              </w:rPr>
-            </w:r>
-            <w:r>
-              <w:rPr>
                 <w:b/>
                 <w:i w:val="0"/>
+                <w:color w:val="FFFFFF"/>
                 <w:sz w:val="19"/>
               </w:rPr>
               <w:t>Comentarii</w:t>
@@ -2367,13 +2199,9 @@
             </w:pPr>
             <w:r>
               <w:rPr>
-                <w:color w:val="FFFFFF"/>
-              </w:rPr>
-            </w:r>
-            <w:r>
-              <w:rPr>
                 <w:b/>
                 <w:i w:val="0"/>
+                <w:color w:val="FFFFFF"/>
                 <w:sz w:val="19"/>
               </w:rPr>
               <w:t>Decizie</w:t>
@@ -2392,13 +2220,9 @@
             </w:pPr>
             <w:r>
               <w:rPr>
-                <w:color w:val="FFFFFF"/>
-              </w:rPr>
-            </w:r>
-            <w:r>
-              <w:rPr>
                 <w:b/>
                 <w:i w:val="0"/>
+                <w:color w:val="FFFFFF"/>
                 <w:sz w:val="19"/>
               </w:rPr>
               <w:t>Comentariu editor</w:t>
@@ -2416,7 +2240,6 @@
             <w:pPr>
               <w:spacing w:after="40" w:line="240" w:lineRule="auto"/>
             </w:pPr>
-            <w:r/>
             <w:r>
               <w:rPr>
                 <w:b w:val="0"/>
@@ -2436,7 +2259,6 @@
             <w:pPr>
               <w:spacing w:after="40" w:line="240" w:lineRule="auto"/>
             </w:pPr>
-            <w:r/>
             <w:r>
               <w:rPr>
                 <w:b w:val="0"/>
@@ -2456,7 +2278,6 @@
             <w:pPr>
               <w:spacing w:after="40" w:line="240" w:lineRule="auto"/>
             </w:pPr>
-            <w:r/>
             <w:r>
               <w:rPr>
                 <w:b w:val="0"/>
@@ -2476,7 +2297,6 @@
             <w:pPr>
               <w:spacing w:after="40" w:line="240" w:lineRule="auto"/>
             </w:pPr>
-            <w:r/>
             <w:r>
               <w:rPr>
                 <w:b w:val="0"/>
@@ -2496,7 +2316,6 @@
             <w:pPr>
               <w:spacing w:after="40" w:line="240" w:lineRule="auto"/>
             </w:pPr>
-            <w:r/>
             <w:r>
               <w:rPr>
                 <w:b w:val="0"/>
@@ -2516,7 +2335,6 @@
             <w:pPr>
               <w:spacing w:after="40" w:line="240" w:lineRule="auto"/>
             </w:pPr>
-            <w:r/>
             <w:r>
               <w:rPr>
                 <w:b w:val="0"/>
@@ -2536,7 +2354,6 @@
             <w:pPr>
               <w:spacing w:after="40" w:line="240" w:lineRule="auto"/>
             </w:pPr>
-            <w:r/>
             <w:r>
               <w:rPr>
                 <w:b w:val="0"/>
@@ -2555,7 +2372,6 @@
             <w:pPr>
               <w:spacing w:after="40" w:line="240" w:lineRule="auto"/>
             </w:pPr>
-            <w:r/>
             <w:r>
               <w:rPr>
                 <w:b w:val="0"/>
@@ -2576,7 +2392,6 @@
             <w:pPr>
               <w:spacing w:after="40" w:line="240" w:lineRule="auto"/>
             </w:pPr>
-            <w:r/>
             <w:r>
               <w:rPr>
                 <w:b w:val="0"/>
@@ -2596,7 +2411,6 @@
             <w:pPr>
               <w:spacing w:after="40" w:line="240" w:lineRule="auto"/>
             </w:pPr>
-            <w:r/>
             <w:r>
               <w:rPr>
                 <w:b w:val="0"/>
@@ -2616,7 +2430,6 @@
             <w:pPr>
               <w:spacing w:after="40" w:line="240" w:lineRule="auto"/>
             </w:pPr>
-            <w:r/>
             <w:r>
               <w:rPr>
                 <w:b w:val="0"/>
@@ -2636,7 +2449,6 @@
             <w:pPr>
               <w:spacing w:after="40" w:line="240" w:lineRule="auto"/>
             </w:pPr>
-            <w:r/>
             <w:r>
               <w:rPr>
                 <w:b w:val="0"/>
@@ -2656,7 +2468,6 @@
             <w:pPr>
               <w:spacing w:after="40" w:line="240" w:lineRule="auto"/>
             </w:pPr>
-            <w:r/>
             <w:r>
               <w:rPr>
                 <w:b w:val="0"/>
@@ -2676,7 +2487,6 @@
             <w:pPr>
               <w:spacing w:after="40" w:line="240" w:lineRule="auto"/>
             </w:pPr>
-            <w:r/>
             <w:r>
               <w:rPr>
                 <w:b w:val="0"/>
@@ -2696,7 +2506,6 @@
             <w:pPr>
               <w:spacing w:after="40" w:line="240" w:lineRule="auto"/>
             </w:pPr>
-            <w:r/>
             <w:r>
               <w:rPr>
                 <w:b w:val="0"/>
@@ -2715,7 +2524,6 @@
             <w:pPr>
               <w:spacing w:after="40" w:line="240" w:lineRule="auto"/>
             </w:pPr>
-            <w:r/>
             <w:r>
               <w:rPr>
                 <w:b w:val="0"/>
@@ -2778,13 +2586,9 @@
             </w:pPr>
             <w:r>
               <w:rPr>
-                <w:color w:val="FFFFFF"/>
-              </w:rPr>
-            </w:r>
-            <w:r>
-              <w:rPr>
                 <w:b/>
                 <w:i w:val="0"/>
+                <w:color w:val="FFFFFF"/>
                 <w:sz w:val="19"/>
               </w:rPr>
               <w:t>Tip</w:t>
@@ -2803,13 +2607,9 @@
             </w:pPr>
             <w:r>
               <w:rPr>
-                <w:color w:val="FFFFFF"/>
-              </w:rPr>
-            </w:r>
-            <w:r>
-              <w:rPr>
                 <w:b/>
                 <w:i w:val="0"/>
+                <w:color w:val="FFFFFF"/>
                 <w:sz w:val="19"/>
               </w:rPr>
               <w:t>Examen</w:t>
@@ -2828,13 +2628,9 @@
             </w:pPr>
             <w:r>
               <w:rPr>
-                <w:color w:val="FFFFFF"/>
-              </w:rPr>
-            </w:r>
-            <w:r>
-              <w:rPr>
                 <w:b/>
                 <w:i w:val="0"/>
+                <w:color w:val="FFFFFF"/>
                 <w:sz w:val="19"/>
               </w:rPr>
               <w:t>Indicație</w:t>
@@ -2853,13 +2649,9 @@
             </w:pPr>
             <w:r>
               <w:rPr>
-                <w:color w:val="FFFFFF"/>
-              </w:rPr>
-            </w:r>
-            <w:r>
-              <w:rPr>
                 <w:b/>
                 <w:i w:val="0"/>
+                <w:color w:val="FFFFFF"/>
                 <w:sz w:val="19"/>
               </w:rPr>
               <w:t>Grad</w:t>
@@ -2878,13 +2670,9 @@
             </w:pPr>
             <w:r>
               <w:rPr>
-                <w:color w:val="FFFFFF"/>
-              </w:rPr>
-            </w:r>
-            <w:r>
-              <w:rPr>
                 <w:b/>
                 <w:i w:val="0"/>
+                <w:color w:val="FFFFFF"/>
                 <w:sz w:val="19"/>
               </w:rPr>
               <w:t>Doză</w:t>
@@ -2903,13 +2691,9 @@
             </w:pPr>
             <w:r>
               <w:rPr>
-                <w:color w:val="FFFFFF"/>
-              </w:rPr>
-            </w:r>
-            <w:r>
-              <w:rPr>
                 <w:b/>
                 <w:i w:val="0"/>
+                <w:color w:val="FFFFFF"/>
                 <w:sz w:val="19"/>
               </w:rPr>
               <w:t>Comentarii</w:t>
@@ -2928,13 +2712,9 @@
             </w:pPr>
             <w:r>
               <w:rPr>
-                <w:color w:val="FFFFFF"/>
-              </w:rPr>
-            </w:r>
-            <w:r>
-              <w:rPr>
                 <w:b/>
                 <w:i w:val="0"/>
+                <w:color w:val="FFFFFF"/>
                 <w:sz w:val="19"/>
               </w:rPr>
               <w:t>Decizie</w:t>
@@ -2953,13 +2733,9 @@
             </w:pPr>
             <w:r>
               <w:rPr>
-                <w:color w:val="FFFFFF"/>
-              </w:rPr>
-            </w:r>
-            <w:r>
-              <w:rPr>
                 <w:b/>
                 <w:i w:val="0"/>
+                <w:color w:val="FFFFFF"/>
                 <w:sz w:val="19"/>
               </w:rPr>
               <w:t>Comentariu editor</w:t>
@@ -2977,7 +2753,6 @@
             <w:pPr>
               <w:spacing w:after="40" w:line="240" w:lineRule="auto"/>
             </w:pPr>
-            <w:r/>
             <w:r>
               <w:rPr>
                 <w:b w:val="0"/>
@@ -2997,7 +2772,6 @@
             <w:pPr>
               <w:spacing w:after="40" w:line="240" w:lineRule="auto"/>
             </w:pPr>
-            <w:r/>
             <w:r>
               <w:rPr>
                 <w:b w:val="0"/>
@@ -3017,7 +2791,6 @@
             <w:pPr>
               <w:spacing w:after="40" w:line="240" w:lineRule="auto"/>
             </w:pPr>
-            <w:r/>
             <w:r>
               <w:rPr>
                 <w:b w:val="0"/>
@@ -3037,7 +2810,6 @@
             <w:pPr>
               <w:spacing w:after="40" w:line="240" w:lineRule="auto"/>
             </w:pPr>
-            <w:r/>
             <w:r>
               <w:rPr>
                 <w:b w:val="0"/>
@@ -3057,7 +2829,6 @@
             <w:pPr>
               <w:spacing w:after="40" w:line="240" w:lineRule="auto"/>
             </w:pPr>
-            <w:r/>
             <w:r>
               <w:rPr>
                 <w:b w:val="0"/>
@@ -3077,7 +2848,6 @@
             <w:pPr>
               <w:spacing w:after="40" w:line="240" w:lineRule="auto"/>
             </w:pPr>
-            <w:r/>
             <w:r>
               <w:rPr>
                 <w:b w:val="0"/>
@@ -3097,7 +2867,6 @@
             <w:pPr>
               <w:spacing w:after="40" w:line="240" w:lineRule="auto"/>
             </w:pPr>
-            <w:r/>
             <w:r>
               <w:rPr>
                 <w:b w:val="0"/>
@@ -3116,7 +2885,6 @@
             <w:pPr>
               <w:spacing w:after="40" w:line="240" w:lineRule="auto"/>
             </w:pPr>
-            <w:r/>
             <w:r>
               <w:rPr>
                 <w:b w:val="0"/>
@@ -3134,7 +2902,7 @@
         <w:pStyle w:val="Heading3"/>
       </w:pPr>
       <w:r>
-        <w:t>Torace, pulmon, cord — Malformații pulmonare congenitale (CPAM / sechestrare pulmonară) – bilanț postnatal</w:t>
+        <w:t>Torace, pulmon, cord — Malformații pulmonare congenitale (CPAM / sechestru pulmonar) – bilanț postnatal</w:t>
       </w:r>
     </w:p>
     <w:p>
@@ -3179,13 +2947,9 @@
             </w:pPr>
             <w:r>
               <w:rPr>
-                <w:color w:val="FFFFFF"/>
-              </w:rPr>
-            </w:r>
-            <w:r>
-              <w:rPr>
                 <w:b/>
                 <w:i w:val="0"/>
+                <w:color w:val="FFFFFF"/>
                 <w:sz w:val="19"/>
               </w:rPr>
               <w:t>Tip</w:t>
@@ -3204,13 +2968,9 @@
             </w:pPr>
             <w:r>
               <w:rPr>
-                <w:color w:val="FFFFFF"/>
-              </w:rPr>
-            </w:r>
-            <w:r>
-              <w:rPr>
                 <w:b/>
                 <w:i w:val="0"/>
+                <w:color w:val="FFFFFF"/>
                 <w:sz w:val="19"/>
               </w:rPr>
               <w:t>Examen</w:t>
@@ -3229,13 +2989,9 @@
             </w:pPr>
             <w:r>
               <w:rPr>
-                <w:color w:val="FFFFFF"/>
-              </w:rPr>
-            </w:r>
-            <w:r>
-              <w:rPr>
                 <w:b/>
                 <w:i w:val="0"/>
+                <w:color w:val="FFFFFF"/>
                 <w:sz w:val="19"/>
               </w:rPr>
               <w:t>Indicație</w:t>
@@ -3254,13 +3010,9 @@
             </w:pPr>
             <w:r>
               <w:rPr>
-                <w:color w:val="FFFFFF"/>
-              </w:rPr>
-            </w:r>
-            <w:r>
-              <w:rPr>
                 <w:b/>
                 <w:i w:val="0"/>
+                <w:color w:val="FFFFFF"/>
                 <w:sz w:val="19"/>
               </w:rPr>
               <w:t>Grad</w:t>
@@ -3279,13 +3031,9 @@
             </w:pPr>
             <w:r>
               <w:rPr>
-                <w:color w:val="FFFFFF"/>
-              </w:rPr>
-            </w:r>
-            <w:r>
-              <w:rPr>
                 <w:b/>
                 <w:i w:val="0"/>
+                <w:color w:val="FFFFFF"/>
                 <w:sz w:val="19"/>
               </w:rPr>
               <w:t>Doză</w:t>
@@ -3304,13 +3052,9 @@
             </w:pPr>
             <w:r>
               <w:rPr>
-                <w:color w:val="FFFFFF"/>
-              </w:rPr>
-            </w:r>
-            <w:r>
-              <w:rPr>
                 <w:b/>
                 <w:i w:val="0"/>
+                <w:color w:val="FFFFFF"/>
                 <w:sz w:val="19"/>
               </w:rPr>
               <w:t>Comentarii</w:t>
@@ -3329,13 +3073,9 @@
             </w:pPr>
             <w:r>
               <w:rPr>
-                <w:color w:val="FFFFFF"/>
-              </w:rPr>
-            </w:r>
-            <w:r>
-              <w:rPr>
                 <w:b/>
                 <w:i w:val="0"/>
+                <w:color w:val="FFFFFF"/>
                 <w:sz w:val="19"/>
               </w:rPr>
               <w:t>Decizie</w:t>
@@ -3354,13 +3094,9 @@
             </w:pPr>
             <w:r>
               <w:rPr>
-                <w:color w:val="FFFFFF"/>
-              </w:rPr>
-            </w:r>
-            <w:r>
-              <w:rPr>
                 <w:b/>
                 <w:i w:val="0"/>
+                <w:color w:val="FFFFFF"/>
                 <w:sz w:val="19"/>
               </w:rPr>
               <w:t>Comentariu editor</w:t>
@@ -3378,7 +3114,6 @@
             <w:pPr>
               <w:spacing w:after="40" w:line="240" w:lineRule="auto"/>
             </w:pPr>
-            <w:r/>
             <w:r>
               <w:rPr>
                 <w:b w:val="0"/>
@@ -3398,7 +3133,6 @@
             <w:pPr>
               <w:spacing w:after="40" w:line="240" w:lineRule="auto"/>
             </w:pPr>
-            <w:r/>
             <w:r>
               <w:rPr>
                 <w:b w:val="0"/>
@@ -3418,7 +3152,6 @@
             <w:pPr>
               <w:spacing w:after="40" w:line="240" w:lineRule="auto"/>
             </w:pPr>
-            <w:r/>
             <w:r>
               <w:rPr>
                 <w:b w:val="0"/>
@@ -3438,7 +3171,6 @@
             <w:pPr>
               <w:spacing w:after="40" w:line="240" w:lineRule="auto"/>
             </w:pPr>
-            <w:r/>
             <w:r>
               <w:rPr>
                 <w:b w:val="0"/>
@@ -3458,7 +3190,6 @@
             <w:pPr>
               <w:spacing w:after="40" w:line="240" w:lineRule="auto"/>
             </w:pPr>
-            <w:r/>
             <w:r>
               <w:rPr>
                 <w:b w:val="0"/>
@@ -3478,7 +3209,6 @@
             <w:pPr>
               <w:spacing w:after="40" w:line="240" w:lineRule="auto"/>
             </w:pPr>
-            <w:r/>
             <w:r>
               <w:rPr>
                 <w:b w:val="0"/>
@@ -3498,7 +3228,6 @@
             <w:pPr>
               <w:spacing w:after="40" w:line="240" w:lineRule="auto"/>
             </w:pPr>
-            <w:r/>
             <w:r>
               <w:rPr>
                 <w:b w:val="0"/>
@@ -3517,7 +3246,6 @@
             <w:pPr>
               <w:spacing w:after="40" w:line="240" w:lineRule="auto"/>
             </w:pPr>
-            <w:r/>
             <w:r>
               <w:rPr>
                 <w:b w:val="0"/>
@@ -3538,7 +3266,6 @@
             <w:pPr>
               <w:spacing w:after="40" w:line="240" w:lineRule="auto"/>
             </w:pPr>
-            <w:r/>
             <w:r>
               <w:rPr>
                 <w:b w:val="0"/>
@@ -3558,7 +3285,6 @@
             <w:pPr>
               <w:spacing w:after="40" w:line="240" w:lineRule="auto"/>
             </w:pPr>
-            <w:r/>
             <w:r>
               <w:rPr>
                 <w:b w:val="0"/>
@@ -3578,7 +3304,6 @@
             <w:pPr>
               <w:spacing w:after="40" w:line="240" w:lineRule="auto"/>
             </w:pPr>
-            <w:r/>
             <w:r>
               <w:rPr>
                 <w:b w:val="0"/>
@@ -3598,7 +3323,6 @@
             <w:pPr>
               <w:spacing w:after="40" w:line="240" w:lineRule="auto"/>
             </w:pPr>
-            <w:r/>
             <w:r>
               <w:rPr>
                 <w:b w:val="0"/>
@@ -3618,7 +3342,6 @@
             <w:pPr>
               <w:spacing w:after="40" w:line="240" w:lineRule="auto"/>
             </w:pPr>
-            <w:r/>
             <w:r>
               <w:rPr>
                 <w:b w:val="0"/>
@@ -3638,7 +3361,6 @@
             <w:pPr>
               <w:spacing w:after="40" w:line="240" w:lineRule="auto"/>
             </w:pPr>
-            <w:r/>
             <w:r>
               <w:rPr>
                 <w:b w:val="0"/>
@@ -3658,7 +3380,6 @@
             <w:pPr>
               <w:spacing w:after="40" w:line="240" w:lineRule="auto"/>
             </w:pPr>
-            <w:r/>
             <w:r>
               <w:rPr>
                 <w:b w:val="0"/>
@@ -3677,7 +3398,6 @@
             <w:pPr>
               <w:spacing w:after="40" w:line="240" w:lineRule="auto"/>
             </w:pPr>
-            <w:r/>
             <w:r>
               <w:rPr>
                 <w:b w:val="0"/>
@@ -3740,13 +3460,9 @@
             </w:pPr>
             <w:r>
               <w:rPr>
-                <w:color w:val="FFFFFF"/>
-              </w:rPr>
-            </w:r>
-            <w:r>
-              <w:rPr>
                 <w:b/>
                 <w:i w:val="0"/>
+                <w:color w:val="FFFFFF"/>
                 <w:sz w:val="19"/>
               </w:rPr>
               <w:t>Tip</w:t>
@@ -3765,13 +3481,9 @@
             </w:pPr>
             <w:r>
               <w:rPr>
-                <w:color w:val="FFFFFF"/>
-              </w:rPr>
-            </w:r>
-            <w:r>
-              <w:rPr>
                 <w:b/>
                 <w:i w:val="0"/>
+                <w:color w:val="FFFFFF"/>
                 <w:sz w:val="19"/>
               </w:rPr>
               <w:t>Examen</w:t>
@@ -3790,13 +3502,9 @@
             </w:pPr>
             <w:r>
               <w:rPr>
-                <w:color w:val="FFFFFF"/>
-              </w:rPr>
-            </w:r>
-            <w:r>
-              <w:rPr>
                 <w:b/>
                 <w:i w:val="0"/>
+                <w:color w:val="FFFFFF"/>
                 <w:sz w:val="19"/>
               </w:rPr>
               <w:t>Indicație</w:t>
@@ -3815,13 +3523,9 @@
             </w:pPr>
             <w:r>
               <w:rPr>
-                <w:color w:val="FFFFFF"/>
-              </w:rPr>
-            </w:r>
-            <w:r>
-              <w:rPr>
                 <w:b/>
                 <w:i w:val="0"/>
+                <w:color w:val="FFFFFF"/>
                 <w:sz w:val="19"/>
               </w:rPr>
               <w:t>Grad</w:t>
@@ -3840,13 +3544,9 @@
             </w:pPr>
             <w:r>
               <w:rPr>
-                <w:color w:val="FFFFFF"/>
-              </w:rPr>
-            </w:r>
-            <w:r>
-              <w:rPr>
                 <w:b/>
                 <w:i w:val="0"/>
+                <w:color w:val="FFFFFF"/>
                 <w:sz w:val="19"/>
               </w:rPr>
               <w:t>Doză</w:t>
@@ -3865,13 +3565,9 @@
             </w:pPr>
             <w:r>
               <w:rPr>
-                <w:color w:val="FFFFFF"/>
-              </w:rPr>
-            </w:r>
-            <w:r>
-              <w:rPr>
                 <w:b/>
                 <w:i w:val="0"/>
+                <w:color w:val="FFFFFF"/>
                 <w:sz w:val="19"/>
               </w:rPr>
               <w:t>Comentarii</w:t>
@@ -3890,13 +3586,9 @@
             </w:pPr>
             <w:r>
               <w:rPr>
-                <w:color w:val="FFFFFF"/>
-              </w:rPr>
-            </w:r>
-            <w:r>
-              <w:rPr>
                 <w:b/>
                 <w:i w:val="0"/>
+                <w:color w:val="FFFFFF"/>
                 <w:sz w:val="19"/>
               </w:rPr>
               <w:t>Decizie</w:t>
@@ -3915,13 +3607,9 @@
             </w:pPr>
             <w:r>
               <w:rPr>
-                <w:color w:val="FFFFFF"/>
-              </w:rPr>
-            </w:r>
-            <w:r>
-              <w:rPr>
                 <w:b/>
                 <w:i w:val="0"/>
+                <w:color w:val="FFFFFF"/>
                 <w:sz w:val="19"/>
               </w:rPr>
               <w:t>Comentariu editor</w:t>
@@ -3939,7 +3627,6 @@
             <w:pPr>
               <w:spacing w:after="40" w:line="240" w:lineRule="auto"/>
             </w:pPr>
-            <w:r/>
             <w:r>
               <w:rPr>
                 <w:b w:val="0"/>
@@ -3959,7 +3646,6 @@
             <w:pPr>
               <w:spacing w:after="40" w:line="240" w:lineRule="auto"/>
             </w:pPr>
-            <w:r/>
             <w:r>
               <w:rPr>
                 <w:b w:val="0"/>
@@ -3979,7 +3665,6 @@
             <w:pPr>
               <w:spacing w:after="40" w:line="240" w:lineRule="auto"/>
             </w:pPr>
-            <w:r/>
             <w:r>
               <w:rPr>
                 <w:b w:val="0"/>
@@ -3999,7 +3684,6 @@
             <w:pPr>
               <w:spacing w:after="40" w:line="240" w:lineRule="auto"/>
             </w:pPr>
-            <w:r/>
             <w:r>
               <w:rPr>
                 <w:b w:val="0"/>
@@ -4019,7 +3703,6 @@
             <w:pPr>
               <w:spacing w:after="40" w:line="240" w:lineRule="auto"/>
             </w:pPr>
-            <w:r/>
             <w:r>
               <w:rPr>
                 <w:b w:val="0"/>
@@ -4039,7 +3722,6 @@
             <w:pPr>
               <w:spacing w:after="40" w:line="240" w:lineRule="auto"/>
             </w:pPr>
-            <w:r/>
             <w:r>
               <w:rPr>
                 <w:b w:val="0"/>
@@ -4059,7 +3741,6 @@
             <w:pPr>
               <w:spacing w:after="40" w:line="240" w:lineRule="auto"/>
             </w:pPr>
-            <w:r/>
             <w:r>
               <w:rPr>
                 <w:b w:val="0"/>
@@ -4078,7 +3759,6 @@
             <w:pPr>
               <w:spacing w:after="40" w:line="240" w:lineRule="auto"/>
             </w:pPr>
-            <w:r/>
             <w:r>
               <w:rPr>
                 <w:b w:val="0"/>
@@ -4141,13 +3821,9 @@
             </w:pPr>
             <w:r>
               <w:rPr>
-                <w:color w:val="FFFFFF"/>
-              </w:rPr>
-            </w:r>
-            <w:r>
-              <w:rPr>
                 <w:b/>
                 <w:i w:val="0"/>
+                <w:color w:val="FFFFFF"/>
                 <w:sz w:val="19"/>
               </w:rPr>
               <w:t>Tip</w:t>
@@ -4166,13 +3842,9 @@
             </w:pPr>
             <w:r>
               <w:rPr>
-                <w:color w:val="FFFFFF"/>
-              </w:rPr>
-            </w:r>
-            <w:r>
-              <w:rPr>
                 <w:b/>
                 <w:i w:val="0"/>
+                <w:color w:val="FFFFFF"/>
                 <w:sz w:val="19"/>
               </w:rPr>
               <w:t>Examen</w:t>
@@ -4191,13 +3863,9 @@
             </w:pPr>
             <w:r>
               <w:rPr>
-                <w:color w:val="FFFFFF"/>
-              </w:rPr>
-            </w:r>
-            <w:r>
-              <w:rPr>
                 <w:b/>
                 <w:i w:val="0"/>
+                <w:color w:val="FFFFFF"/>
                 <w:sz w:val="19"/>
               </w:rPr>
               <w:t>Indicație</w:t>
@@ -4216,13 +3884,9 @@
             </w:pPr>
             <w:r>
               <w:rPr>
-                <w:color w:val="FFFFFF"/>
-              </w:rPr>
-            </w:r>
-            <w:r>
-              <w:rPr>
                 <w:b/>
                 <w:i w:val="0"/>
+                <w:color w:val="FFFFFF"/>
                 <w:sz w:val="19"/>
               </w:rPr>
               <w:t>Grad</w:t>
@@ -4241,13 +3905,9 @@
             </w:pPr>
             <w:r>
               <w:rPr>
-                <w:color w:val="FFFFFF"/>
-              </w:rPr>
-            </w:r>
-            <w:r>
-              <w:rPr>
                 <w:b/>
                 <w:i w:val="0"/>
+                <w:color w:val="FFFFFF"/>
                 <w:sz w:val="19"/>
               </w:rPr>
               <w:t>Doză</w:t>
@@ -4266,13 +3926,9 @@
             </w:pPr>
             <w:r>
               <w:rPr>
-                <w:color w:val="FFFFFF"/>
-              </w:rPr>
-            </w:r>
-            <w:r>
-              <w:rPr>
                 <w:b/>
                 <w:i w:val="0"/>
+                <w:color w:val="FFFFFF"/>
                 <w:sz w:val="19"/>
               </w:rPr>
               <w:t>Comentarii</w:t>
@@ -4291,13 +3947,9 @@
             </w:pPr>
             <w:r>
               <w:rPr>
-                <w:color w:val="FFFFFF"/>
-              </w:rPr>
-            </w:r>
-            <w:r>
-              <w:rPr>
                 <w:b/>
                 <w:i w:val="0"/>
+                <w:color w:val="FFFFFF"/>
                 <w:sz w:val="19"/>
               </w:rPr>
               <w:t>Decizie</w:t>
@@ -4316,13 +3968,9 @@
             </w:pPr>
             <w:r>
               <w:rPr>
-                <w:color w:val="FFFFFF"/>
-              </w:rPr>
-            </w:r>
-            <w:r>
-              <w:rPr>
                 <w:b/>
                 <w:i w:val="0"/>
+                <w:color w:val="FFFFFF"/>
                 <w:sz w:val="19"/>
               </w:rPr>
               <w:t>Comentariu editor</w:t>
@@ -4340,7 +3988,6 @@
             <w:pPr>
               <w:spacing w:after="40" w:line="240" w:lineRule="auto"/>
             </w:pPr>
-            <w:r/>
             <w:r>
               <w:rPr>
                 <w:b w:val="0"/>
@@ -4360,7 +4007,6 @@
             <w:pPr>
               <w:spacing w:after="40" w:line="240" w:lineRule="auto"/>
             </w:pPr>
-            <w:r/>
             <w:r>
               <w:rPr>
                 <w:b w:val="0"/>
@@ -4380,7 +4026,6 @@
             <w:pPr>
               <w:spacing w:after="40" w:line="240" w:lineRule="auto"/>
             </w:pPr>
-            <w:r/>
             <w:r>
               <w:rPr>
                 <w:b w:val="0"/>
@@ -4400,7 +4045,6 @@
             <w:pPr>
               <w:spacing w:after="40" w:line="240" w:lineRule="auto"/>
             </w:pPr>
-            <w:r/>
             <w:r>
               <w:rPr>
                 <w:b w:val="0"/>
@@ -4420,7 +4064,6 @@
             <w:pPr>
               <w:spacing w:after="40" w:line="240" w:lineRule="auto"/>
             </w:pPr>
-            <w:r/>
             <w:r>
               <w:rPr>
                 <w:b w:val="0"/>
@@ -4440,7 +4083,6 @@
             <w:pPr>
               <w:spacing w:after="40" w:line="240" w:lineRule="auto"/>
             </w:pPr>
-            <w:r/>
             <w:r>
               <w:rPr>
                 <w:b w:val="0"/>
@@ -4460,7 +4102,6 @@
             <w:pPr>
               <w:spacing w:after="40" w:line="240" w:lineRule="auto"/>
             </w:pPr>
-            <w:r/>
             <w:r>
               <w:rPr>
                 <w:b w:val="0"/>
@@ -4479,7 +4120,6 @@
             <w:pPr>
               <w:spacing w:after="40" w:line="240" w:lineRule="auto"/>
             </w:pPr>
-            <w:r/>
             <w:r>
               <w:rPr>
                 <w:b w:val="0"/>
@@ -4500,7 +4140,6 @@
             <w:pPr>
               <w:spacing w:after="40" w:line="240" w:lineRule="auto"/>
             </w:pPr>
-            <w:r/>
             <w:r>
               <w:rPr>
                 <w:b w:val="0"/>
@@ -4520,7 +4159,6 @@
             <w:pPr>
               <w:spacing w:after="40" w:line="240" w:lineRule="auto"/>
             </w:pPr>
-            <w:r/>
             <w:r>
               <w:rPr>
                 <w:b w:val="0"/>
@@ -4540,7 +4178,6 @@
             <w:pPr>
               <w:spacing w:after="40" w:line="240" w:lineRule="auto"/>
             </w:pPr>
-            <w:r/>
             <w:r>
               <w:rPr>
                 <w:b w:val="0"/>
@@ -4560,7 +4197,6 @@
             <w:pPr>
               <w:spacing w:after="40" w:line="240" w:lineRule="auto"/>
             </w:pPr>
-            <w:r/>
             <w:r>
               <w:rPr>
                 <w:b w:val="0"/>
@@ -4580,7 +4216,6 @@
             <w:pPr>
               <w:spacing w:after="40" w:line="240" w:lineRule="auto"/>
             </w:pPr>
-            <w:r/>
             <w:r>
               <w:rPr>
                 <w:b w:val="0"/>
@@ -4600,7 +4235,6 @@
             <w:pPr>
               <w:spacing w:after="40" w:line="240" w:lineRule="auto"/>
             </w:pPr>
-            <w:r/>
             <w:r>
               <w:rPr>
                 <w:b w:val="0"/>
@@ -4620,7 +4254,6 @@
             <w:pPr>
               <w:spacing w:after="40" w:line="240" w:lineRule="auto"/>
             </w:pPr>
-            <w:r/>
             <w:r>
               <w:rPr>
                 <w:b w:val="0"/>
@@ -4639,7 +4272,6 @@
             <w:pPr>
               <w:spacing w:after="40" w:line="240" w:lineRule="auto"/>
             </w:pPr>
-            <w:r/>
             <w:r>
               <w:rPr>
                 <w:b w:val="0"/>
@@ -4702,13 +4334,9 @@
             </w:pPr>
             <w:r>
               <w:rPr>
-                <w:color w:val="FFFFFF"/>
-              </w:rPr>
-            </w:r>
-            <w:r>
-              <w:rPr>
                 <w:b/>
                 <w:i w:val="0"/>
+                <w:color w:val="FFFFFF"/>
                 <w:sz w:val="19"/>
               </w:rPr>
               <w:t>Tip</w:t>
@@ -4727,13 +4355,9 @@
             </w:pPr>
             <w:r>
               <w:rPr>
-                <w:color w:val="FFFFFF"/>
-              </w:rPr>
-            </w:r>
-            <w:r>
-              <w:rPr>
                 <w:b/>
                 <w:i w:val="0"/>
+                <w:color w:val="FFFFFF"/>
                 <w:sz w:val="19"/>
               </w:rPr>
               <w:t>Examen</w:t>
@@ -4752,13 +4376,9 @@
             </w:pPr>
             <w:r>
               <w:rPr>
-                <w:color w:val="FFFFFF"/>
-              </w:rPr>
-            </w:r>
-            <w:r>
-              <w:rPr>
                 <w:b/>
                 <w:i w:val="0"/>
+                <w:color w:val="FFFFFF"/>
                 <w:sz w:val="19"/>
               </w:rPr>
               <w:t>Indicație</w:t>
@@ -4777,13 +4397,9 @@
             </w:pPr>
             <w:r>
               <w:rPr>
-                <w:color w:val="FFFFFF"/>
-              </w:rPr>
-            </w:r>
-            <w:r>
-              <w:rPr>
                 <w:b/>
                 <w:i w:val="0"/>
+                <w:color w:val="FFFFFF"/>
                 <w:sz w:val="19"/>
               </w:rPr>
               <w:t>Grad</w:t>
@@ -4802,13 +4418,9 @@
             </w:pPr>
             <w:r>
               <w:rPr>
-                <w:color w:val="FFFFFF"/>
-              </w:rPr>
-            </w:r>
-            <w:r>
-              <w:rPr>
                 <w:b/>
                 <w:i w:val="0"/>
+                <w:color w:val="FFFFFF"/>
                 <w:sz w:val="19"/>
               </w:rPr>
               <w:t>Doză</w:t>
@@ -4827,13 +4439,9 @@
             </w:pPr>
             <w:r>
               <w:rPr>
-                <w:color w:val="FFFFFF"/>
-              </w:rPr>
-            </w:r>
-            <w:r>
-              <w:rPr>
                 <w:b/>
                 <w:i w:val="0"/>
+                <w:color w:val="FFFFFF"/>
                 <w:sz w:val="19"/>
               </w:rPr>
               <w:t>Comentarii</w:t>
@@ -4852,13 +4460,9 @@
             </w:pPr>
             <w:r>
               <w:rPr>
-                <w:color w:val="FFFFFF"/>
-              </w:rPr>
-            </w:r>
-            <w:r>
-              <w:rPr>
                 <w:b/>
                 <w:i w:val="0"/>
+                <w:color w:val="FFFFFF"/>
                 <w:sz w:val="19"/>
               </w:rPr>
               <w:t>Decizie</w:t>
@@ -4877,13 +4481,9 @@
             </w:pPr>
             <w:r>
               <w:rPr>
-                <w:color w:val="FFFFFF"/>
-              </w:rPr>
-            </w:r>
-            <w:r>
-              <w:rPr>
                 <w:b/>
                 <w:i w:val="0"/>
+                <w:color w:val="FFFFFF"/>
                 <w:sz w:val="19"/>
               </w:rPr>
               <w:t>Comentariu editor</w:t>
@@ -4901,7 +4501,6 @@
             <w:pPr>
               <w:spacing w:after="40" w:line="240" w:lineRule="auto"/>
             </w:pPr>
-            <w:r/>
             <w:r>
               <w:rPr>
                 <w:b w:val="0"/>
@@ -4921,7 +4520,6 @@
             <w:pPr>
               <w:spacing w:after="40" w:line="240" w:lineRule="auto"/>
             </w:pPr>
-            <w:r/>
             <w:r>
               <w:rPr>
                 <w:b w:val="0"/>
@@ -4941,7 +4539,6 @@
             <w:pPr>
               <w:spacing w:after="40" w:line="240" w:lineRule="auto"/>
             </w:pPr>
-            <w:r/>
             <w:r>
               <w:rPr>
                 <w:b w:val="0"/>
@@ -4961,7 +4558,6 @@
             <w:pPr>
               <w:spacing w:after="40" w:line="240" w:lineRule="auto"/>
             </w:pPr>
-            <w:r/>
             <w:r>
               <w:rPr>
                 <w:b w:val="0"/>
@@ -4981,7 +4577,6 @@
             <w:pPr>
               <w:spacing w:after="40" w:line="240" w:lineRule="auto"/>
             </w:pPr>
-            <w:r/>
             <w:r>
               <w:rPr>
                 <w:b w:val="0"/>
@@ -5001,7 +4596,6 @@
             <w:pPr>
               <w:spacing w:after="40" w:line="240" w:lineRule="auto"/>
             </w:pPr>
-            <w:r/>
             <w:r>
               <w:rPr>
                 <w:b w:val="0"/>
@@ -5021,7 +4615,6 @@
             <w:pPr>
               <w:spacing w:after="40" w:line="240" w:lineRule="auto"/>
             </w:pPr>
-            <w:r/>
             <w:r>
               <w:rPr>
                 <w:b w:val="0"/>
@@ -5040,7 +4633,6 @@
             <w:pPr>
               <w:spacing w:after="40" w:line="240" w:lineRule="auto"/>
             </w:pPr>
-            <w:r/>
             <w:r>
               <w:rPr>
                 <w:b w:val="0"/>
@@ -5061,7 +4653,6 @@
             <w:pPr>
               <w:spacing w:after="40" w:line="240" w:lineRule="auto"/>
             </w:pPr>
-            <w:r/>
             <w:r>
               <w:rPr>
                 <w:b w:val="0"/>
@@ -5081,7 +4672,6 @@
             <w:pPr>
               <w:spacing w:after="40" w:line="240" w:lineRule="auto"/>
             </w:pPr>
-            <w:r/>
             <w:r>
               <w:rPr>
                 <w:b w:val="0"/>
@@ -5101,7 +4691,6 @@
             <w:pPr>
               <w:spacing w:after="40" w:line="240" w:lineRule="auto"/>
             </w:pPr>
-            <w:r/>
             <w:r>
               <w:rPr>
                 <w:b w:val="0"/>
@@ -5121,7 +4710,6 @@
             <w:pPr>
               <w:spacing w:after="40" w:line="240" w:lineRule="auto"/>
             </w:pPr>
-            <w:r/>
             <w:r>
               <w:rPr>
                 <w:b w:val="0"/>
@@ -5141,7 +4729,6 @@
             <w:pPr>
               <w:spacing w:after="40" w:line="240" w:lineRule="auto"/>
             </w:pPr>
-            <w:r/>
             <w:r>
               <w:rPr>
                 <w:b w:val="0"/>
@@ -5161,7 +4748,6 @@
             <w:pPr>
               <w:spacing w:after="40" w:line="240" w:lineRule="auto"/>
             </w:pPr>
-            <w:r/>
             <w:r>
               <w:rPr>
                 <w:b w:val="0"/>
@@ -5181,7 +4767,6 @@
             <w:pPr>
               <w:spacing w:after="40" w:line="240" w:lineRule="auto"/>
             </w:pPr>
-            <w:r/>
             <w:r>
               <w:rPr>
                 <w:b w:val="0"/>
@@ -5200,7 +4785,6 @@
             <w:pPr>
               <w:spacing w:after="40" w:line="240" w:lineRule="auto"/>
             </w:pPr>
-            <w:r/>
             <w:r>
               <w:rPr>
                 <w:b w:val="0"/>
@@ -5221,7 +4805,6 @@
             <w:pPr>
               <w:spacing w:after="40" w:line="240" w:lineRule="auto"/>
             </w:pPr>
-            <w:r/>
             <w:r>
               <w:rPr>
                 <w:b w:val="0"/>
@@ -5241,7 +4824,6 @@
             <w:pPr>
               <w:spacing w:after="40" w:line="240" w:lineRule="auto"/>
             </w:pPr>
-            <w:r/>
             <w:r>
               <w:rPr>
                 <w:b w:val="0"/>
@@ -5261,7 +4843,6 @@
             <w:pPr>
               <w:spacing w:after="40" w:line="240" w:lineRule="auto"/>
             </w:pPr>
-            <w:r/>
             <w:r>
               <w:rPr>
                 <w:b w:val="0"/>
@@ -5281,7 +4862,6 @@
             <w:pPr>
               <w:spacing w:after="40" w:line="240" w:lineRule="auto"/>
             </w:pPr>
-            <w:r/>
             <w:r>
               <w:rPr>
                 <w:b w:val="0"/>
@@ -5301,7 +4881,6 @@
             <w:pPr>
               <w:spacing w:after="40" w:line="240" w:lineRule="auto"/>
             </w:pPr>
-            <w:r/>
             <w:r>
               <w:rPr>
                 <w:b w:val="0"/>
@@ -5321,7 +4900,6 @@
             <w:pPr>
               <w:spacing w:after="40" w:line="240" w:lineRule="auto"/>
             </w:pPr>
-            <w:r/>
             <w:r>
               <w:rPr>
                 <w:b w:val="0"/>
@@ -5341,7 +4919,6 @@
             <w:pPr>
               <w:spacing w:after="40" w:line="240" w:lineRule="auto"/>
             </w:pPr>
-            <w:r/>
             <w:r>
               <w:rPr>
                 <w:b w:val="0"/>
@@ -5360,7 +4937,6 @@
             <w:pPr>
               <w:spacing w:after="40" w:line="240" w:lineRule="auto"/>
             </w:pPr>
-            <w:r/>
             <w:r>
               <w:rPr>
                 <w:b w:val="0"/>

</xml_diff>